<commit_message>
Newest promptcraft reformatted S1
</commit_message>
<xml_diff>
--- a/docs/asset-management/Recording Scripts/Eli_Recording_Script.docx
+++ b/docs/asset-management/Recording Scripts/Eli_Recording_Script.docx
@@ -2,167 +2,175 @@
 <file path=word/document.xml><?xml version="1.0" encoding="utf-8"?>
 <w:document xmlns:wpc="http://schemas.microsoft.com/office/word/2010/wordprocessingCanvas" xmlns:mo="http://schemas.microsoft.com/office/mac/office/2008/main" xmlns:mc="http://schemas.openxmlformats.org/markup-compatibility/2006" xmlns:mv="urn:schemas-microsoft-com:mac:vml" xmlns:o="urn:schemas-microsoft-com:office:office" xmlns:r="http://schemas.openxmlformats.org/officeDocument/2006/relationships" xmlns:m="http://schemas.openxmlformats.org/officeDocument/2006/math" xmlns:v="urn:schemas-microsoft-com:vml" xmlns:wp14="http://schemas.microsoft.com/office/word/2010/wordprocessingDrawing" xmlns:wp="http://schemas.openxmlformats.org/drawingml/2006/wordprocessingDrawing" xmlns:w10="urn:schemas-microsoft-com:office:word" xmlns:w="http://schemas.openxmlformats.org/wordprocessingml/2006/main" xmlns:w14="http://schemas.microsoft.com/office/word/2010/wordml" xmlns:wpg="http://schemas.microsoft.com/office/word/2010/wordprocessingGroup" xmlns:wpi="http://schemas.microsoft.com/office/word/2010/wordprocessingInk" xmlns:wne="http://schemas.microsoft.com/office/word/2006/wordml" xmlns:wps="http://schemas.microsoft.com/office/word/2010/wordprocessingShape" mc:Ignorable="w14 wp14">
   <w:body>
-    <w:tbl>
-      <w:tblPr>
-        <w:tblW w:type="auto" w:w="0"/>
+    <w:p>
+      <w:pPr>
+        <w:pStyle w:val="Title"/>
         <w:jc w:val="center"/>
-        <w:tblLayout w:type="fixed"/>
-        <w:tblLook w:firstColumn="1" w:firstRow="1" w:lastColumn="0" w:lastRow="0" w:noHBand="0" w:noVBand="1" w:val="04A0"/>
-      </w:tblPr>
-      <w:tblGrid>
-        <w:gridCol w:w="10080"/>
-      </w:tblGrid>
-      <w:tr>
-        <w:tc>
-          <w:tcPr>
-            <w:tcW w:type="dxa" w:w="10224"/>
-            <w:shd w:fill="0B2348"/>
-            <w:vAlign w:val="center"/>
-          </w:tcPr>
-          <w:p>
-            <w:pPr>
-              <w:jc w:val="left"/>
-            </w:pPr>
-            <w:r>
-              <w:rPr>
-                <w:rFonts w:ascii="Aptos Display" w:hAnsi="Aptos Display"/>
-                <w:b/>
-                <w:color w:val="FFFFFF"/>
-                <w:sz w:val="48"/>
-              </w:rPr>
-              <w:t>Eli Recording Script</w:t>
-            </w:r>
-          </w:p>
-          <w:p>
-            <w:r>
-              <w:rPr>
-                <w:rFonts w:ascii="Aptos" w:hAnsi="Aptos"/>
-                <w:color w:val="D9EAF7"/>
-                <w:sz w:val="20"/>
-              </w:rPr>
-              <w:t>PromptCraft · Scenario 1: Content Avalanche · Current active lines</w:t>
-            </w:r>
-          </w:p>
-        </w:tc>
-      </w:tr>
-    </w:tbl>
+      </w:pPr>
+      <w:r>
+        <w:rPr>
+          <w:color w:val="000000"/>
+        </w:rPr>
+        <w:t>Eli Recording Guide</w:t>
+      </w:r>
+    </w:p>
     <w:p>
       <w:r>
         <w:rPr>
           <w:b/>
-          <w:sz w:val="22"/>
         </w:rPr>
-        <w:t>Eli should sound like a grounded, methodical adult student, not a polished narrator and not a stereotype.</w:t>
+        <w:t xml:space="preserve">Purpose. </w:t>
+      </w:r>
+      <w:r>
+        <w:t>Use this guide to decide whether a recording session is ready. The voice tracker and current application source control the approved line list; this document does not copy dialogue that may become stale.</w:t>
+      </w:r>
+    </w:p>
+    <w:p>
+      <w:pPr>
+        <w:pStyle w:val="Heading1"/>
+      </w:pPr>
+      <w:r>
+        <w:t>Current production status</w:t>
       </w:r>
     </w:p>
     <w:tbl>
       <w:tblPr>
+        <w:tblStyle w:val="TableGrid"/>
         <w:tblW w:type="auto" w:w="0"/>
         <w:jc w:val="center"/>
         <w:tblLook w:firstColumn="1" w:firstRow="1" w:lastColumn="0" w:lastRow="0" w:noHBand="0" w:noVBand="1" w:val="04A0"/>
       </w:tblPr>
       <w:tblGrid>
-        <w:gridCol w:w="10224"/>
+        <w:gridCol w:w="4939"/>
+        <w:gridCol w:w="4939"/>
       </w:tblGrid>
       <w:tr>
+        <w:trPr>
+          <w:tblHeader w:val="true"/>
+        </w:trPr>
         <w:tc>
           <w:tcPr>
-            <w:tcW w:type="dxa" w:w="10224"/>
-            <w:shd w:fill="EAF4FB"/>
-            <w:tcBorders>
-              <w:top w:val="single" w:sz="8" w:color="C8D5E3"/>
-              <w:start w:val="single" w:sz="8" w:color="C8D5E3"/>
-              <w:bottom w:val="single" w:sz="8" w:color="C8D5E3"/>
-              <w:end w:val="single" w:sz="8" w:color="C8D5E3"/>
-            </w:tcBorders>
+            <w:tcW w:type="dxa" w:w="4939"/>
+            <w:shd w:fill="0D2A55"/>
           </w:tcPr>
           <w:p>
             <w:r>
               <w:rPr>
-                <w:rFonts w:ascii="Aptos" w:hAnsi="Aptos"/>
                 <w:b/>
-                <w:color w:val="0B2348"/>
-                <w:sz w:val="22"/>
+                <w:color w:val="FFFFFF"/>
               </w:rPr>
-              <w:t>Performance direction</w:t>
+              <w:t>Item</w:t>
             </w:r>
           </w:p>
+        </w:tc>
+        <w:tc>
+          <w:tcPr>
+            <w:tcW w:type="dxa" w:w="4939"/>
+            <w:shd w:fill="0D2A55"/>
+          </w:tcPr>
           <w:p>
-            <w:pPr>
-              <w:spacing w:after="40"/>
-            </w:pPr>
             <w:r>
               <w:rPr>
-                <w:rFonts w:ascii="Aptos" w:hAnsi="Aptos"/>
-                <w:color w:val="14233B"/>
-                <w:sz w:val="19"/>
+                <w:b/>
+                <w:color w:val="FFFFFF"/>
               </w:rPr>
-              <w:t>• Reserved, economical delivery — Eli doesn't talk to fill silence; he chooses his words.</w:t>
+              <w:t>Current state</w:t>
             </w:r>
           </w:p>
+        </w:tc>
+      </w:tr>
+      <w:tr>
+        <w:tc>
+          <w:tcPr>
+            <w:tcW w:type="dxa" w:w="4939"/>
+            <w:vAlign w:val="center"/>
+          </w:tcPr>
           <w:p>
-            <w:pPr>
-              <w:spacing w:after="40"/>
-            </w:pPr>
             <w:r>
-              <w:rPr>
-                <w:rFonts w:ascii="Aptos" w:hAnsi="Aptos"/>
-                <w:color w:val="14233B"/>
-                <w:sz w:val="19"/>
-              </w:rPr>
-              <w:t>• Uncertain/frustrated lines stay matter-of-fact, not anxious or emotional — he states a problem, he doesn't vent.</w:t>
+              <w:t>Speaker</w:t>
             </w:r>
           </w:p>
+        </w:tc>
+        <w:tc>
+          <w:tcPr>
+            <w:tcW w:type="dxa" w:w="4939"/>
+            <w:vAlign w:val="center"/>
+          </w:tcPr>
           <w:p>
-            <w:pPr>
-              <w:spacing w:after="40"/>
-            </w:pPr>
             <w:r>
-              <w:rPr>
-                <w:rFonts w:ascii="Aptos" w:hAnsi="Aptos"/>
-                <w:color w:val="14233B"/>
-                <w:sz w:val="19"/>
-              </w:rPr>
-              <w:t>• Thinking lines should sound like Eli is working through something practical, step by step, not thinking out loud freely.</w:t>
+              <w:t>Eli</w:t>
             </w:r>
           </w:p>
+        </w:tc>
+      </w:tr>
+      <w:tr>
+        <w:tc>
+          <w:tcPr>
+            <w:tcW w:type="dxa" w:w="4939"/>
+            <w:vAlign w:val="center"/>
+          </w:tcPr>
           <w:p>
-            <w:pPr>
-              <w:spacing w:after="40"/>
-            </w:pPr>
             <w:r>
-              <w:rPr>
-                <w:rFonts w:ascii="Aptos" w:hAnsi="Aptos"/>
-                <w:color w:val="14233B"/>
-                <w:sz w:val="19"/>
-              </w:rPr>
-              <w:t>• Confident lines are settled and quiet, not triumphant — earned certainty, not excitement.</w:t>
+              <w:t>Current role</w:t>
             </w:r>
           </w:p>
+        </w:tc>
+        <w:tc>
+          <w:tcPr>
+            <w:tcW w:type="dxa" w:w="4939"/>
+            <w:vAlign w:val="center"/>
+          </w:tcPr>
           <w:p>
-            <w:pPr>
-              <w:spacing w:after="40"/>
-            </w:pPr>
             <w:r>
-              <w:rPr>
-                <w:rFonts w:ascii="Aptos" w:hAnsi="Aptos"/>
-                <w:color w:val="14233B"/>
-                <w:sz w:val="19"/>
-              </w:rPr>
-              <w:t>• Save each final clip using the exact filename shown.</w:t>
+              <w:t>Earlier Scenario 1 student voice retained in legacy assets and documentation. Maya is the current Scenario 1 student.</w:t>
             </w:r>
           </w:p>
+        </w:tc>
+      </w:tr>
+      <w:tr>
+        <w:tc>
+          <w:tcPr>
+            <w:tcW w:type="dxa" w:w="4939"/>
+            <w:vAlign w:val="center"/>
+          </w:tcPr>
           <w:p>
-            <w:pPr>
-              <w:spacing w:after="40"/>
-            </w:pPr>
             <w:r>
-              <w:rPr>
-                <w:rFonts w:ascii="Aptos" w:hAnsi="Aptos"/>
-                <w:color w:val="14233B"/>
-                <w:sz w:val="19"/>
-              </w:rPr>
-              <w:t>• All current Eli lines are marked for wording review before recording.</w:t>
+              <w:t>Recording decision</w:t>
+            </w:r>
+          </w:p>
+        </w:tc>
+        <w:tc>
+          <w:tcPr>
+            <w:tcW w:type="dxa" w:w="4939"/>
+            <w:vAlign w:val="center"/>
+          </w:tcPr>
+          <w:p>
+            <w:r>
+              <w:t>Do not record the old Content Avalanche line list. Keep Eli on hold unless a current scenario explicitly restores the character.</w:t>
+            </w:r>
+          </w:p>
+        </w:tc>
+      </w:tr>
+      <w:tr>
+        <w:tc>
+          <w:tcPr>
+            <w:tcW w:type="dxa" w:w="4939"/>
+            <w:vAlign w:val="center"/>
+          </w:tcPr>
+          <w:p>
+            <w:r>
+              <w:t>Technical baseline</w:t>
+            </w:r>
+          </w:p>
+        </w:tc>
+        <w:tc>
+          <w:tcPr>
+            <w:tcW w:type="dxa" w:w="4939"/>
+            <w:vAlign w:val="center"/>
+          </w:tcPr>
+          <w:p>
+            <w:r>
+              <w:t>PROMPTCRAFT_V429, Patch 575, asset manifest v150</w:t>
             </w:r>
           </w:p>
         </w:tc>
@@ -170,2263 +178,98 @@
     </w:tbl>
     <w:p>
       <w:pPr>
-        <w:spacing w:after="40"/>
+        <w:pStyle w:val="Heading1"/>
       </w:pPr>
+      <w:r>
+        <w:t>Before recording</w:t>
+      </w:r>
     </w:p>
     <w:p>
       <w:pPr>
-        <w:spacing w:before="160" w:after="100"/>
+        <w:pStyle w:val="ListBullet"/>
       </w:pPr>
       <w:r>
-        <w:rPr>
-          <w:rFonts w:ascii="Aptos Display" w:hAnsi="Aptos Display"/>
-          <w:b/>
-          <w:color w:val="0B2348"/>
-          <w:sz w:val="30"/>
-        </w:rPr>
-        <w:t>Evidence station intro</w:t>
+        <w:t>Open PromptCraft_Voice_Recording_Tracker.xlsx and confirm the line is marked Approved to Record.</w:t>
       </w:r>
-      <w:r>
-        <w:rPr>
-          <w:rFonts w:ascii="Aptos" w:hAnsi="Aptos"/>
-          <w:i/>
-          <w:color w:val="61748A"/>
-          <w:sz w:val="18"/>
-        </w:rPr>
-        <w:t xml:space="preserve">  Review wording before recording.</w:t>
-      </w:r>
-    </w:p>
-    <w:tbl>
-      <w:tblPr>
-        <w:tblW w:type="auto" w:w="0"/>
-        <w:jc w:val="center"/>
-        <w:tblLayout w:type="fixed"/>
-        <w:tblLook w:firstColumn="1" w:firstRow="1" w:lastColumn="0" w:lastRow="0" w:noHBand="0" w:noVBand="1" w:val="04A0"/>
-      </w:tblPr>
-      <w:tblGrid>
-        <w:gridCol w:w="3096"/>
-        <w:gridCol w:w="6984"/>
-      </w:tblGrid>
-      <w:tr>
-        <w:trPr>
-          <w:cantSplit/>
-        </w:trPr>
-        <w:tc>
-          <w:tcPr>
-            <w:tcW w:type="dxa" w:w="5112"/>
-            <w:shd w:fill="FBF7ED"/>
-            <w:vAlign w:val="top"/>
-            <w:tcBorders>
-              <w:top w:val="single" w:sz="6" w:color="C8D5E3"/>
-              <w:start w:val="single" w:sz="6" w:color="C8D5E3"/>
-              <w:bottom w:val="single" w:sz="6" w:color="C8D5E3"/>
-              <w:end w:val="single" w:sz="6" w:color="C8D5E3"/>
-            </w:tcBorders>
-          </w:tcPr>
-          <w:p>
-            <w:pPr>
-              <w:spacing w:after="40"/>
-            </w:pPr>
-            <w:r>
-              <w:rPr>
-                <w:rFonts w:ascii="Aptos" w:hAnsi="Aptos"/>
-                <w:b/>
-                <w:color w:val="0B2348"/>
-                <w:sz w:val="20"/>
-              </w:rPr>
-              <w:t>01 · e-s1-ca-05</w:t>
-            </w:r>
-          </w:p>
-          <w:p>
-            <w:pPr>
-              <w:spacing w:after="20"/>
-            </w:pPr>
-            <w:r>
-              <w:rPr>
-                <w:rFonts w:ascii="Aptos" w:hAnsi="Aptos"/>
-                <w:b/>
-                <w:color w:val="1178B5"/>
-                <w:sz w:val="18"/>
-              </w:rPr>
-              <w:t>e-s1-ca-05.mp3</w:t>
-            </w:r>
-          </w:p>
-          <w:p>
-            <w:pPr>
-              <w:spacing w:after="20"/>
-            </w:pPr>
-            <w:r>
-              <w:rPr>
-                <w:rFonts w:ascii="Aptos" w:hAnsi="Aptos"/>
-                <w:color w:val="61748A"/>
-                <w:sz w:val="17"/>
-              </w:rPr>
-              <w:t>Uncertain · s1_canvas_evidence_intro</w:t>
-            </w:r>
-          </w:p>
-          <w:p>
-            <w:pPr>
-              <w:spacing w:after="0"/>
-            </w:pPr>
-            <w:r>
-              <w:rPr>
-                <w:rFonts w:ascii="Aptos" w:hAnsi="Aptos"/>
-                <w:b/>
-                <w:color w:val="9A5B00"/>
-                <w:sz w:val="16"/>
-              </w:rPr>
-              <w:t>REVIEW WORDING</w:t>
-            </w:r>
-          </w:p>
-        </w:tc>
-        <w:tc>
-          <w:tcPr>
-            <w:tcW w:type="dxa" w:w="5112"/>
-            <w:shd w:fill="FFFFFF"/>
-            <w:vAlign w:val="top"/>
-            <w:tcBorders>
-              <w:top w:val="single" w:sz="6" w:color="C8D5E3"/>
-              <w:start w:val="single" w:sz="6" w:color="C8D5E3"/>
-              <w:bottom w:val="single" w:sz="6" w:color="C8D5E3"/>
-              <w:end w:val="single" w:sz="6" w:color="C8D5E3"/>
-            </w:tcBorders>
-          </w:tcPr>
-          <w:p>
-            <w:pPr>
-              <w:spacing w:after="0"/>
-            </w:pPr>
-            <w:r>
-              <w:rPr>
-                <w:rFonts w:ascii="Aptos" w:hAnsi="Aptos"/>
-                <w:color w:val="14233B"/>
-                <w:sz w:val="23"/>
-              </w:rPr>
-              <w:t>There's no shortage of material here. What's missing is the order of operations — what to do first, what the assignment actually needs, or where the real instructions are hiding.</w:t>
-            </w:r>
-          </w:p>
-        </w:tc>
-      </w:tr>
-    </w:tbl>
-    <w:p>
-      <w:pPr>
-        <w:spacing w:after="40"/>
-      </w:pPr>
     </w:p>
     <w:p>
       <w:pPr>
-        <w:spacing w:before="160" w:after="100"/>
+        <w:pStyle w:val="ListBullet"/>
       </w:pPr>
       <w:r>
-        <w:rPr>
-          <w:rFonts w:ascii="Aptos Display" w:hAnsi="Aptos Display"/>
-          <w:b/>
-          <w:color w:val="0B2348"/>
-          <w:sz w:val="30"/>
-        </w:rPr>
-        <w:t>Case 1: Module structure</w:t>
+        <w:t>Compare the exported line with the current browser source. Stop if wording, speaker, or scenario numbering differs.</w:t>
       </w:r>
-      <w:r>
-        <w:rPr>
-          <w:rFonts w:ascii="Aptos" w:hAnsi="Aptos"/>
-          <w:i/>
-          <w:color w:val="61748A"/>
-          <w:sz w:val="18"/>
-        </w:rPr>
-        <w:t xml:space="preserve">  Review wording before recording.</w:t>
-      </w:r>
-    </w:p>
-    <w:tbl>
-      <w:tblPr>
-        <w:tblW w:type="auto" w:w="0"/>
-        <w:jc w:val="center"/>
-        <w:tblLayout w:type="fixed"/>
-        <w:tblLook w:firstColumn="1" w:firstRow="1" w:lastColumn="0" w:lastRow="0" w:noHBand="0" w:noVBand="1" w:val="04A0"/>
-      </w:tblPr>
-      <w:tblGrid>
-        <w:gridCol w:w="3096"/>
-        <w:gridCol w:w="6984"/>
-      </w:tblGrid>
-      <w:tr>
-        <w:trPr>
-          <w:cantSplit/>
-        </w:trPr>
-        <w:tc>
-          <w:tcPr>
-            <w:tcW w:type="dxa" w:w="5112"/>
-            <w:shd w:fill="FBF7ED"/>
-            <w:vAlign w:val="top"/>
-            <w:tcBorders>
-              <w:top w:val="single" w:sz="6" w:color="C8D5E3"/>
-              <w:start w:val="single" w:sz="6" w:color="C8D5E3"/>
-              <w:bottom w:val="single" w:sz="6" w:color="C8D5E3"/>
-              <w:end w:val="single" w:sz="6" w:color="C8D5E3"/>
-            </w:tcBorders>
-          </w:tcPr>
-          <w:p>
-            <w:pPr>
-              <w:spacing w:after="40"/>
-            </w:pPr>
-            <w:r>
-              <w:rPr>
-                <w:rFonts w:ascii="Aptos" w:hAnsi="Aptos"/>
-                <w:b/>
-                <w:color w:val="0B2348"/>
-                <w:sz w:val="20"/>
-              </w:rPr>
-              <w:t>02 · e-s1-case-01b</w:t>
-            </w:r>
-          </w:p>
-          <w:p>
-            <w:pPr>
-              <w:spacing w:after="20"/>
-            </w:pPr>
-            <w:r>
-              <w:rPr>
-                <w:rFonts w:ascii="Aptos" w:hAnsi="Aptos"/>
-                <w:b/>
-                <w:color w:val="1178B5"/>
-                <w:sz w:val="18"/>
-              </w:rPr>
-              <w:t>e-s1-case-01b.mp3</w:t>
-            </w:r>
-          </w:p>
-          <w:p>
-            <w:pPr>
-              <w:spacing w:after="20"/>
-            </w:pPr>
-            <w:r>
-              <w:rPr>
-                <w:rFonts w:ascii="Aptos" w:hAnsi="Aptos"/>
-                <w:color w:val="61748A"/>
-                <w:sz w:val="17"/>
-              </w:rPr>
-              <w:t>Uncertain · s1_case_module_briefing</w:t>
-            </w:r>
-          </w:p>
-          <w:p>
-            <w:pPr>
-              <w:spacing w:after="0"/>
-            </w:pPr>
-            <w:r>
-              <w:rPr>
-                <w:rFonts w:ascii="Aptos" w:hAnsi="Aptos"/>
-                <w:b/>
-                <w:color w:val="9A5B00"/>
-                <w:sz w:val="16"/>
-              </w:rPr>
-              <w:t>REVIEW WORDING</w:t>
-            </w:r>
-          </w:p>
-        </w:tc>
-        <w:tc>
-          <w:tcPr>
-            <w:tcW w:type="dxa" w:w="5112"/>
-            <w:shd w:fill="FFFFFF"/>
-            <w:vAlign w:val="top"/>
-            <w:tcBorders>
-              <w:top w:val="single" w:sz="6" w:color="C8D5E3"/>
-              <w:start w:val="single" w:sz="6" w:color="C8D5E3"/>
-              <w:bottom w:val="single" w:sz="6" w:color="C8D5E3"/>
-              <w:end w:val="single" w:sz="6" w:color="C8D5E3"/>
-            </w:tcBorders>
-          </w:tcPr>
-          <w:p>
-            <w:pPr>
-              <w:spacing w:after="0"/>
-            </w:pPr>
-            <w:r>
-              <w:rPr>
-                <w:rFonts w:ascii="Aptos" w:hAnsi="Aptos"/>
-                <w:color w:val="14233B"/>
-                <w:sz w:val="23"/>
-              </w:rPr>
-              <w:t>I can see the files, notes, examples, quiz, and comparison — all of it's here. But nothing shows me the sequence. It's a parts list with no assembly order.</w:t>
-            </w:r>
-          </w:p>
-        </w:tc>
-      </w:tr>
-    </w:tbl>
-    <w:p>
-      <w:pPr>
-        <w:spacing w:after="40"/>
-      </w:pPr>
-    </w:p>
-    <w:tbl>
-      <w:tblPr>
-        <w:tblW w:type="auto" w:w="0"/>
-        <w:jc w:val="center"/>
-        <w:tblLayout w:type="fixed"/>
-        <w:tblLook w:firstColumn="1" w:firstRow="1" w:lastColumn="0" w:lastRow="0" w:noHBand="0" w:noVBand="1" w:val="04A0"/>
-      </w:tblPr>
-      <w:tblGrid>
-        <w:gridCol w:w="3096"/>
-        <w:gridCol w:w="6984"/>
-      </w:tblGrid>
-      <w:tr>
-        <w:trPr>
-          <w:cantSplit/>
-        </w:trPr>
-        <w:tc>
-          <w:tcPr>
-            <w:tcW w:type="dxa" w:w="5112"/>
-            <w:shd w:fill="FBF7ED"/>
-            <w:vAlign w:val="top"/>
-            <w:tcBorders>
-              <w:top w:val="single" w:sz="6" w:color="C8D5E3"/>
-              <w:start w:val="single" w:sz="6" w:color="C8D5E3"/>
-              <w:bottom w:val="single" w:sz="6" w:color="C8D5E3"/>
-              <w:end w:val="single" w:sz="6" w:color="C8D5E3"/>
-            </w:tcBorders>
-          </w:tcPr>
-          <w:p>
-            <w:pPr>
-              <w:spacing w:after="40"/>
-            </w:pPr>
-            <w:r>
-              <w:rPr>
-                <w:rFonts w:ascii="Aptos" w:hAnsi="Aptos"/>
-                <w:b/>
-                <w:color w:val="0B2348"/>
-                <w:sz w:val="20"/>
-              </w:rPr>
-              <w:t>03 · e-s1-case-01d</w:t>
-            </w:r>
-          </w:p>
-          <w:p>
-            <w:pPr>
-              <w:spacing w:after="20"/>
-            </w:pPr>
-            <w:r>
-              <w:rPr>
-                <w:rFonts w:ascii="Aptos" w:hAnsi="Aptos"/>
-                <w:b/>
-                <w:color w:val="1178B5"/>
-                <w:sz w:val="18"/>
-              </w:rPr>
-              <w:t>e-s1-case-01d.mp3</w:t>
-            </w:r>
-          </w:p>
-          <w:p>
-            <w:pPr>
-              <w:spacing w:after="20"/>
-            </w:pPr>
-            <w:r>
-              <w:rPr>
-                <w:rFonts w:ascii="Aptos" w:hAnsi="Aptos"/>
-                <w:color w:val="61748A"/>
-                <w:sz w:val="17"/>
-              </w:rPr>
-              <w:t>Thinking · s1_case_module_explanation</w:t>
-            </w:r>
-          </w:p>
-          <w:p>
-            <w:pPr>
-              <w:spacing w:after="0"/>
-            </w:pPr>
-            <w:r>
-              <w:rPr>
-                <w:rFonts w:ascii="Aptos" w:hAnsi="Aptos"/>
-                <w:b/>
-                <w:color w:val="9A5B00"/>
-                <w:sz w:val="16"/>
-              </w:rPr>
-              <w:t>REVIEW WORDING</w:t>
-            </w:r>
-          </w:p>
-        </w:tc>
-        <w:tc>
-          <w:tcPr>
-            <w:tcW w:type="dxa" w:w="5112"/>
-            <w:shd w:fill="FFFFFF"/>
-            <w:vAlign w:val="top"/>
-            <w:tcBorders>
-              <w:top w:val="single" w:sz="6" w:color="C8D5E3"/>
-              <w:start w:val="single" w:sz="6" w:color="C8D5E3"/>
-              <w:bottom w:val="single" w:sz="6" w:color="C8D5E3"/>
-              <w:end w:val="single" w:sz="6" w:color="C8D5E3"/>
-            </w:tcBorders>
-          </w:tcPr>
-          <w:p>
-            <w:pPr>
-              <w:spacing w:after="0"/>
-            </w:pPr>
-            <w:r>
-              <w:rPr>
-                <w:rFonts w:ascii="Aptos" w:hAnsi="Aptos"/>
-                <w:color w:val="14233B"/>
-                <w:sz w:val="23"/>
-              </w:rPr>
-              <w:t>So it's not a content problem. It's that I can't see the end state, or how any of these pieces connect into a sequence.</w:t>
-            </w:r>
-          </w:p>
-        </w:tc>
-      </w:tr>
-    </w:tbl>
-    <w:p>
-      <w:pPr>
-        <w:spacing w:after="40"/>
-      </w:pPr>
-    </w:p>
-    <w:tbl>
-      <w:tblPr>
-        <w:tblW w:type="auto" w:w="0"/>
-        <w:jc w:val="center"/>
-        <w:tblLayout w:type="fixed"/>
-        <w:tblLook w:firstColumn="1" w:firstRow="1" w:lastColumn="0" w:lastRow="0" w:noHBand="0" w:noVBand="1" w:val="04A0"/>
-      </w:tblPr>
-      <w:tblGrid>
-        <w:gridCol w:w="3096"/>
-        <w:gridCol w:w="6984"/>
-      </w:tblGrid>
-      <w:tr>
-        <w:trPr>
-          <w:cantSplit/>
-        </w:trPr>
-        <w:tc>
-          <w:tcPr>
-            <w:tcW w:type="dxa" w:w="5112"/>
-            <w:shd w:fill="FBF7ED"/>
-            <w:vAlign w:val="top"/>
-            <w:tcBorders>
-              <w:top w:val="single" w:sz="6" w:color="C8D5E3"/>
-              <w:start w:val="single" w:sz="6" w:color="C8D5E3"/>
-              <w:bottom w:val="single" w:sz="6" w:color="C8D5E3"/>
-              <w:end w:val="single" w:sz="6" w:color="C8D5E3"/>
-            </w:tcBorders>
-          </w:tcPr>
-          <w:p>
-            <w:pPr>
-              <w:spacing w:after="40"/>
-            </w:pPr>
-            <w:r>
-              <w:rPr>
-                <w:rFonts w:ascii="Aptos" w:hAnsi="Aptos"/>
-                <w:b/>
-                <w:color w:val="0B2348"/>
-                <w:sz w:val="20"/>
-              </w:rPr>
-              <w:t>04 · e-s1-case-01ai-b</w:t>
-            </w:r>
-          </w:p>
-          <w:p>
-            <w:pPr>
-              <w:spacing w:after="20"/>
-            </w:pPr>
-            <w:r>
-              <w:rPr>
-                <w:rFonts w:ascii="Aptos" w:hAnsi="Aptos"/>
-                <w:b/>
-                <w:color w:val="1178B5"/>
-                <w:sz w:val="18"/>
-              </w:rPr>
-              <w:t>e-s1-case-01ai-b.mp3</w:t>
-            </w:r>
-          </w:p>
-          <w:p>
-            <w:pPr>
-              <w:spacing w:after="20"/>
-            </w:pPr>
-            <w:r>
-              <w:rPr>
-                <w:rFonts w:ascii="Aptos" w:hAnsi="Aptos"/>
-                <w:color w:val="61748A"/>
-                <w:sz w:val="17"/>
-              </w:rPr>
-              <w:t>Thinking · s1_case_module_ai_demo</w:t>
-            </w:r>
-          </w:p>
-          <w:p>
-            <w:pPr>
-              <w:spacing w:after="0"/>
-            </w:pPr>
-            <w:r>
-              <w:rPr>
-                <w:rFonts w:ascii="Aptos" w:hAnsi="Aptos"/>
-                <w:b/>
-                <w:color w:val="9A5B00"/>
-                <w:sz w:val="16"/>
-              </w:rPr>
-              <w:t>REVIEW WORDING</w:t>
-            </w:r>
-          </w:p>
-        </w:tc>
-        <w:tc>
-          <w:tcPr>
-            <w:tcW w:type="dxa" w:w="5112"/>
-            <w:shd w:fill="FFFFFF"/>
-            <w:vAlign w:val="top"/>
-            <w:tcBorders>
-              <w:top w:val="single" w:sz="6" w:color="C8D5E3"/>
-              <w:start w:val="single" w:sz="6" w:color="C8D5E3"/>
-              <w:bottom w:val="single" w:sz="6" w:color="C8D5E3"/>
-              <w:end w:val="single" w:sz="6" w:color="C8D5E3"/>
-            </w:tcBorders>
-          </w:tcPr>
-          <w:p>
-            <w:pPr>
-              <w:spacing w:after="0"/>
-            </w:pPr>
-            <w:r>
-              <w:rPr>
-                <w:rFonts w:ascii="Aptos" w:hAnsi="Aptos"/>
-                <w:color w:val="14233B"/>
-                <w:sz w:val="23"/>
-              </w:rPr>
-              <w:t>The draft gets us a map fast. But the labels alone can't tell Babbage what I actually need to understand before I reach the assignment.</w:t>
-            </w:r>
-          </w:p>
-        </w:tc>
-      </w:tr>
-    </w:tbl>
-    <w:p>
-      <w:pPr>
-        <w:spacing w:after="40"/>
-      </w:pPr>
-    </w:p>
-    <w:tbl>
-      <w:tblPr>
-        <w:tblW w:type="auto" w:w="0"/>
-        <w:jc w:val="center"/>
-        <w:tblLayout w:type="fixed"/>
-        <w:tblLook w:firstColumn="1" w:firstRow="1" w:lastColumn="0" w:lastRow="0" w:noHBand="0" w:noVBand="1" w:val="04A0"/>
-      </w:tblPr>
-      <w:tblGrid>
-        <w:gridCol w:w="3096"/>
-        <w:gridCol w:w="6984"/>
-      </w:tblGrid>
-      <w:tr>
-        <w:trPr>
-          <w:cantSplit/>
-        </w:trPr>
-        <w:tc>
-          <w:tcPr>
-            <w:tcW w:type="dxa" w:w="5112"/>
-            <w:shd w:fill="FBF7ED"/>
-            <w:vAlign w:val="top"/>
-            <w:tcBorders>
-              <w:top w:val="single" w:sz="6" w:color="C8D5E3"/>
-              <w:start w:val="single" w:sz="6" w:color="C8D5E3"/>
-              <w:bottom w:val="single" w:sz="6" w:color="C8D5E3"/>
-              <w:end w:val="single" w:sz="6" w:color="C8D5E3"/>
-            </w:tcBorders>
-          </w:tcPr>
-          <w:p>
-            <w:pPr>
-              <w:spacing w:after="40"/>
-            </w:pPr>
-            <w:r>
-              <w:rPr>
-                <w:rFonts w:ascii="Aptos" w:hAnsi="Aptos"/>
-                <w:b/>
-                <w:color w:val="0B2348"/>
-                <w:sz w:val="20"/>
-              </w:rPr>
-              <w:t>05 · e-s1-case-01f</w:t>
-            </w:r>
-          </w:p>
-          <w:p>
-            <w:pPr>
-              <w:spacing w:after="20"/>
-            </w:pPr>
-            <w:r>
-              <w:rPr>
-                <w:rFonts w:ascii="Aptos" w:hAnsi="Aptos"/>
-                <w:b/>
-                <w:color w:val="1178B5"/>
-                <w:sz w:val="18"/>
-              </w:rPr>
-              <w:t>e-s1-case-01f.mp3</w:t>
-            </w:r>
-          </w:p>
-          <w:p>
-            <w:pPr>
-              <w:spacing w:after="20"/>
-            </w:pPr>
-            <w:r>
-              <w:rPr>
-                <w:rFonts w:ascii="Aptos" w:hAnsi="Aptos"/>
-                <w:color w:val="61748A"/>
-                <w:sz w:val="17"/>
-              </w:rPr>
-              <w:t>Confident · s1_case_module_reveal</w:t>
-            </w:r>
-          </w:p>
-          <w:p>
-            <w:pPr>
-              <w:spacing w:after="0"/>
-            </w:pPr>
-            <w:r>
-              <w:rPr>
-                <w:rFonts w:ascii="Aptos" w:hAnsi="Aptos"/>
-                <w:b/>
-                <w:color w:val="9A5B00"/>
-                <w:sz w:val="16"/>
-              </w:rPr>
-              <w:t>REVIEW WORDING</w:t>
-            </w:r>
-          </w:p>
-        </w:tc>
-        <w:tc>
-          <w:tcPr>
-            <w:tcW w:type="dxa" w:w="5112"/>
-            <w:shd w:fill="FFFFFF"/>
-            <w:vAlign w:val="top"/>
-            <w:tcBorders>
-              <w:top w:val="single" w:sz="6" w:color="C8D5E3"/>
-              <w:start w:val="single" w:sz="6" w:color="C8D5E3"/>
-              <w:bottom w:val="single" w:sz="6" w:color="C8D5E3"/>
-              <w:end w:val="single" w:sz="6" w:color="C8D5E3"/>
-            </w:tcBorders>
-          </w:tcPr>
-          <w:p>
-            <w:pPr>
-              <w:spacing w:after="0"/>
-            </w:pPr>
-            <w:r>
-              <w:rPr>
-                <w:rFonts w:ascii="Aptos" w:hAnsi="Aptos"/>
-                <w:color w:val="14233B"/>
-                <w:sz w:val="23"/>
-              </w:rPr>
-              <w:t>Now there's a Start Here point and a route — Learn, Submit, Continue. I know where I'm headed before I open a single file.</w:t>
-            </w:r>
-          </w:p>
-        </w:tc>
-      </w:tr>
-    </w:tbl>
-    <w:p>
-      <w:pPr>
-        <w:spacing w:after="40"/>
-      </w:pPr>
     </w:p>
     <w:p>
       <w:pPr>
-        <w:spacing w:before="160" w:after="100"/>
+        <w:pStyle w:val="ListBullet"/>
       </w:pPr>
       <w:r>
-        <w:rPr>
-          <w:rFonts w:ascii="Aptos Display" w:hAnsi="Aptos Display"/>
-          <w:b/>
-          <w:color w:val="0B2348"/>
-          <w:sz w:val="30"/>
-        </w:rPr>
-        <w:t>Case 2: Student path</w:t>
+        <w:t>Use one stable line ID and one audio file per approved line. Preserve legacy path names only when the tracker identifies a compatibility requirement.</w:t>
       </w:r>
-      <w:r>
-        <w:rPr>
-          <w:rFonts w:ascii="Aptos" w:hAnsi="Aptos"/>
-          <w:i/>
-          <w:color w:val="61748A"/>
-          <w:sz w:val="18"/>
-        </w:rPr>
-        <w:t xml:space="preserve">  Review wording before recording.</w:t>
-      </w:r>
-    </w:p>
-    <w:tbl>
-      <w:tblPr>
-        <w:tblW w:type="auto" w:w="0"/>
-        <w:jc w:val="center"/>
-        <w:tblLayout w:type="fixed"/>
-        <w:tblLook w:firstColumn="1" w:firstRow="1" w:lastColumn="0" w:lastRow="0" w:noHBand="0" w:noVBand="1" w:val="04A0"/>
-      </w:tblPr>
-      <w:tblGrid>
-        <w:gridCol w:w="3096"/>
-        <w:gridCol w:w="6984"/>
-      </w:tblGrid>
-      <w:tr>
-        <w:trPr>
-          <w:cantSplit/>
-        </w:trPr>
-        <w:tc>
-          <w:tcPr>
-            <w:tcW w:type="dxa" w:w="5112"/>
-            <w:shd w:fill="FBF7ED"/>
-            <w:vAlign w:val="top"/>
-            <w:tcBorders>
-              <w:top w:val="single" w:sz="6" w:color="C8D5E3"/>
-              <w:start w:val="single" w:sz="6" w:color="C8D5E3"/>
-              <w:bottom w:val="single" w:sz="6" w:color="C8D5E3"/>
-              <w:end w:val="single" w:sz="6" w:color="C8D5E3"/>
-            </w:tcBorders>
-          </w:tcPr>
-          <w:p>
-            <w:pPr>
-              <w:spacing w:after="40"/>
-            </w:pPr>
-            <w:r>
-              <w:rPr>
-                <w:rFonts w:ascii="Aptos" w:hAnsi="Aptos"/>
-                <w:b/>
-                <w:color w:val="0B2348"/>
-                <w:sz w:val="20"/>
-              </w:rPr>
-              <w:t>06 · e-s1-case-02b</w:t>
-            </w:r>
-          </w:p>
-          <w:p>
-            <w:pPr>
-              <w:spacing w:after="20"/>
-            </w:pPr>
-            <w:r>
-              <w:rPr>
-                <w:rFonts w:ascii="Aptos" w:hAnsi="Aptos"/>
-                <w:b/>
-                <w:color w:val="1178B5"/>
-                <w:sz w:val="18"/>
-              </w:rPr>
-              <w:t>e-s1-case-02b.mp3</w:t>
-            </w:r>
-          </w:p>
-          <w:p>
-            <w:pPr>
-              <w:spacing w:after="20"/>
-            </w:pPr>
-            <w:r>
-              <w:rPr>
-                <w:rFonts w:ascii="Aptos" w:hAnsi="Aptos"/>
-                <w:color w:val="61748A"/>
-                <w:sz w:val="17"/>
-              </w:rPr>
-              <w:t>Frustrated · s1_case_student_path_briefing</w:t>
-            </w:r>
-          </w:p>
-          <w:p>
-            <w:pPr>
-              <w:spacing w:after="0"/>
-            </w:pPr>
-            <w:r>
-              <w:rPr>
-                <w:rFonts w:ascii="Aptos" w:hAnsi="Aptos"/>
-                <w:b/>
-                <w:color w:val="9A5B00"/>
-                <w:sz w:val="16"/>
-              </w:rPr>
-              <w:t>REVIEW WORDING</w:t>
-            </w:r>
-          </w:p>
-        </w:tc>
-        <w:tc>
-          <w:tcPr>
-            <w:tcW w:type="dxa" w:w="5112"/>
-            <w:shd w:fill="FFFFFF"/>
-            <w:vAlign w:val="top"/>
-            <w:tcBorders>
-              <w:top w:val="single" w:sz="6" w:color="C8D5E3"/>
-              <w:start w:val="single" w:sz="6" w:color="C8D5E3"/>
-              <w:bottom w:val="single" w:sz="6" w:color="C8D5E3"/>
-              <w:end w:val="single" w:sz="6" w:color="C8D5E3"/>
-            </w:tcBorders>
-          </w:tcPr>
-          <w:p>
-            <w:pPr>
-              <w:spacing w:after="0"/>
-            </w:pPr>
-            <w:r>
-              <w:rPr>
-                <w:rFonts w:ascii="Aptos" w:hAnsi="Aptos"/>
-                <w:color w:val="14233B"/>
-                <w:sz w:val="23"/>
-              </w:rPr>
-              <w:t>I've got plenty to open. Nothing tells me what I'm actually trying to accomplish, what comes first, or when Week 4 is even done.</w:t>
-            </w:r>
-          </w:p>
-        </w:tc>
-      </w:tr>
-    </w:tbl>
-    <w:p>
-      <w:pPr>
-        <w:spacing w:after="40"/>
-      </w:pPr>
-    </w:p>
-    <w:tbl>
-      <w:tblPr>
-        <w:tblW w:type="auto" w:w="0"/>
-        <w:jc w:val="center"/>
-        <w:tblLayout w:type="fixed"/>
-        <w:tblLook w:firstColumn="1" w:firstRow="1" w:lastColumn="0" w:lastRow="0" w:noHBand="0" w:noVBand="1" w:val="04A0"/>
-      </w:tblPr>
-      <w:tblGrid>
-        <w:gridCol w:w="3096"/>
-        <w:gridCol w:w="6984"/>
-      </w:tblGrid>
-      <w:tr>
-        <w:trPr>
-          <w:cantSplit/>
-        </w:trPr>
-        <w:tc>
-          <w:tcPr>
-            <w:tcW w:type="dxa" w:w="5112"/>
-            <w:shd w:fill="FBF7ED"/>
-            <w:vAlign w:val="top"/>
-            <w:tcBorders>
-              <w:top w:val="single" w:sz="6" w:color="C8D5E3"/>
-              <w:start w:val="single" w:sz="6" w:color="C8D5E3"/>
-              <w:bottom w:val="single" w:sz="6" w:color="C8D5E3"/>
-              <w:end w:val="single" w:sz="6" w:color="C8D5E3"/>
-            </w:tcBorders>
-          </w:tcPr>
-          <w:p>
-            <w:pPr>
-              <w:spacing w:after="40"/>
-            </w:pPr>
-            <w:r>
-              <w:rPr>
-                <w:rFonts w:ascii="Aptos" w:hAnsi="Aptos"/>
-                <w:b/>
-                <w:color w:val="0B2348"/>
-                <w:sz w:val="20"/>
-              </w:rPr>
-              <w:t>07 · e-s1-case-02d</w:t>
-            </w:r>
-          </w:p>
-          <w:p>
-            <w:pPr>
-              <w:spacing w:after="20"/>
-            </w:pPr>
-            <w:r>
-              <w:rPr>
-                <w:rFonts w:ascii="Aptos" w:hAnsi="Aptos"/>
-                <w:b/>
-                <w:color w:val="1178B5"/>
-                <w:sz w:val="18"/>
-              </w:rPr>
-              <w:t>e-s1-case-02d.mp3</w:t>
-            </w:r>
-          </w:p>
-          <w:p>
-            <w:pPr>
-              <w:spacing w:after="20"/>
-            </w:pPr>
-            <w:r>
-              <w:rPr>
-                <w:rFonts w:ascii="Aptos" w:hAnsi="Aptos"/>
-                <w:color w:val="61748A"/>
-                <w:sz w:val="17"/>
-              </w:rPr>
-              <w:t>Thinking · s1_case_student_path_explanation</w:t>
-            </w:r>
-          </w:p>
-          <w:p>
-            <w:pPr>
-              <w:spacing w:after="0"/>
-            </w:pPr>
-            <w:r>
-              <w:rPr>
-                <w:rFonts w:ascii="Aptos" w:hAnsi="Aptos"/>
-                <w:b/>
-                <w:color w:val="9A5B00"/>
-                <w:sz w:val="16"/>
-              </w:rPr>
-              <w:t>REVIEW WORDING</w:t>
-            </w:r>
-          </w:p>
-        </w:tc>
-        <w:tc>
-          <w:tcPr>
-            <w:tcW w:type="dxa" w:w="5112"/>
-            <w:shd w:fill="FFFFFF"/>
-            <w:vAlign w:val="top"/>
-            <w:tcBorders>
-              <w:top w:val="single" w:sz="6" w:color="C8D5E3"/>
-              <w:start w:val="single" w:sz="6" w:color="C8D5E3"/>
-              <w:bottom w:val="single" w:sz="6" w:color="C8D5E3"/>
-              <w:end w:val="single" w:sz="6" w:color="C8D5E3"/>
-            </w:tcBorders>
-          </w:tcPr>
-          <w:p>
-            <w:pPr>
-              <w:spacing w:after="0"/>
-            </w:pPr>
-            <w:r>
-              <w:rPr>
-                <w:rFonts w:ascii="Aptos" w:hAnsi="Aptos"/>
-                <w:color w:val="14233B"/>
-                <w:sz w:val="23"/>
-              </w:rPr>
-              <w:t>The instructor might know the right order. Doesn't help me if that order only exists in someone else's head.</w:t>
-            </w:r>
-          </w:p>
-        </w:tc>
-      </w:tr>
-    </w:tbl>
-    <w:p>
-      <w:pPr>
-        <w:spacing w:after="40"/>
-      </w:pPr>
-    </w:p>
-    <w:tbl>
-      <w:tblPr>
-        <w:tblW w:type="auto" w:w="0"/>
-        <w:jc w:val="center"/>
-        <w:tblLayout w:type="fixed"/>
-        <w:tblLook w:firstColumn="1" w:firstRow="1" w:lastColumn="0" w:lastRow="0" w:noHBand="0" w:noVBand="1" w:val="04A0"/>
-      </w:tblPr>
-      <w:tblGrid>
-        <w:gridCol w:w="3096"/>
-        <w:gridCol w:w="6984"/>
-      </w:tblGrid>
-      <w:tr>
-        <w:trPr>
-          <w:cantSplit/>
-        </w:trPr>
-        <w:tc>
-          <w:tcPr>
-            <w:tcW w:type="dxa" w:w="5112"/>
-            <w:shd w:fill="FBF7ED"/>
-            <w:vAlign w:val="top"/>
-            <w:tcBorders>
-              <w:top w:val="single" w:sz="6" w:color="C8D5E3"/>
-              <w:start w:val="single" w:sz="6" w:color="C8D5E3"/>
-              <w:bottom w:val="single" w:sz="6" w:color="C8D5E3"/>
-              <w:end w:val="single" w:sz="6" w:color="C8D5E3"/>
-            </w:tcBorders>
-          </w:tcPr>
-          <w:p>
-            <w:pPr>
-              <w:spacing w:after="40"/>
-            </w:pPr>
-            <w:r>
-              <w:rPr>
-                <w:rFonts w:ascii="Aptos" w:hAnsi="Aptos"/>
-                <w:b/>
-                <w:color w:val="0B2348"/>
-                <w:sz w:val="20"/>
-              </w:rPr>
-              <w:t>08 · e-s1-case-02ai-b</w:t>
-            </w:r>
-          </w:p>
-          <w:p>
-            <w:pPr>
-              <w:spacing w:after="20"/>
-            </w:pPr>
-            <w:r>
-              <w:rPr>
-                <w:rFonts w:ascii="Aptos" w:hAnsi="Aptos"/>
-                <w:b/>
-                <w:color w:val="1178B5"/>
-                <w:sz w:val="18"/>
-              </w:rPr>
-              <w:t>e-s1-case-02ai-b.mp3</w:t>
-            </w:r>
-          </w:p>
-          <w:p>
-            <w:pPr>
-              <w:spacing w:after="20"/>
-            </w:pPr>
-            <w:r>
-              <w:rPr>
-                <w:rFonts w:ascii="Aptos" w:hAnsi="Aptos"/>
-                <w:color w:val="61748A"/>
-                <w:sz w:val="17"/>
-              </w:rPr>
-              <w:t>Thinking · s1_case_student_path_ai_demo</w:t>
-            </w:r>
-          </w:p>
-          <w:p>
-            <w:pPr>
-              <w:spacing w:after="0"/>
-            </w:pPr>
-            <w:r>
-              <w:rPr>
-                <w:rFonts w:ascii="Aptos" w:hAnsi="Aptos"/>
-                <w:b/>
-                <w:color w:val="9A5B00"/>
-                <w:sz w:val="16"/>
-              </w:rPr>
-              <w:t>REVIEW WORDING</w:t>
-            </w:r>
-          </w:p>
-        </w:tc>
-        <w:tc>
-          <w:tcPr>
-            <w:tcW w:type="dxa" w:w="5112"/>
-            <w:shd w:fill="FFFFFF"/>
-            <w:vAlign w:val="top"/>
-            <w:tcBorders>
-              <w:top w:val="single" w:sz="6" w:color="C8D5E3"/>
-              <w:start w:val="single" w:sz="6" w:color="C8D5E3"/>
-              <w:bottom w:val="single" w:sz="6" w:color="C8D5E3"/>
-              <w:end w:val="single" w:sz="6" w:color="C8D5E3"/>
-            </w:tcBorders>
-          </w:tcPr>
-          <w:p>
-            <w:pPr>
-              <w:spacing w:after="0"/>
-            </w:pPr>
-            <w:r>
-              <w:rPr>
-                <w:rFonts w:ascii="Aptos" w:hAnsi="Aptos"/>
-                <w:color w:val="14233B"/>
-                <w:sz w:val="23"/>
-              </w:rPr>
-              <w:t>It'll flag the missing signals every time, consistently. What it can't do is sit in the course like I do, or know which gap actually stops a student cold.</w:t>
-            </w:r>
-          </w:p>
-        </w:tc>
-      </w:tr>
-    </w:tbl>
-    <w:p>
-      <w:pPr>
-        <w:spacing w:after="40"/>
-      </w:pPr>
-    </w:p>
-    <w:tbl>
-      <w:tblPr>
-        <w:tblW w:type="auto" w:w="0"/>
-        <w:jc w:val="center"/>
-        <w:tblLayout w:type="fixed"/>
-        <w:tblLook w:firstColumn="1" w:firstRow="1" w:lastColumn="0" w:lastRow="0" w:noHBand="0" w:noVBand="1" w:val="04A0"/>
-      </w:tblPr>
-      <w:tblGrid>
-        <w:gridCol w:w="3096"/>
-        <w:gridCol w:w="6984"/>
-      </w:tblGrid>
-      <w:tr>
-        <w:trPr>
-          <w:cantSplit/>
-        </w:trPr>
-        <w:tc>
-          <w:tcPr>
-            <w:tcW w:type="dxa" w:w="5112"/>
-            <w:shd w:fill="FBF7ED"/>
-            <w:vAlign w:val="top"/>
-            <w:tcBorders>
-              <w:top w:val="single" w:sz="6" w:color="C8D5E3"/>
-              <w:start w:val="single" w:sz="6" w:color="C8D5E3"/>
-              <w:bottom w:val="single" w:sz="6" w:color="C8D5E3"/>
-              <w:end w:val="single" w:sz="6" w:color="C8D5E3"/>
-            </w:tcBorders>
-          </w:tcPr>
-          <w:p>
-            <w:pPr>
-              <w:spacing w:after="40"/>
-            </w:pPr>
-            <w:r>
-              <w:rPr>
-                <w:rFonts w:ascii="Aptos" w:hAnsi="Aptos"/>
-                <w:b/>
-                <w:color w:val="0B2348"/>
-                <w:sz w:val="20"/>
-              </w:rPr>
-              <w:t>09 · e-s1-case-02f</w:t>
-            </w:r>
-          </w:p>
-          <w:p>
-            <w:pPr>
-              <w:spacing w:after="20"/>
-            </w:pPr>
-            <w:r>
-              <w:rPr>
-                <w:rFonts w:ascii="Aptos" w:hAnsi="Aptos"/>
-                <w:b/>
-                <w:color w:val="1178B5"/>
-                <w:sz w:val="18"/>
-              </w:rPr>
-              <w:t>e-s1-case-02f.mp3</w:t>
-            </w:r>
-          </w:p>
-          <w:p>
-            <w:pPr>
-              <w:spacing w:after="20"/>
-            </w:pPr>
-            <w:r>
-              <w:rPr>
-                <w:rFonts w:ascii="Aptos" w:hAnsi="Aptos"/>
-                <w:color w:val="61748A"/>
-                <w:sz w:val="17"/>
-              </w:rPr>
-              <w:t>Confident · s1_case_student_path_reveal</w:t>
-            </w:r>
-          </w:p>
-          <w:p>
-            <w:pPr>
-              <w:spacing w:after="0"/>
-            </w:pPr>
-            <w:r>
-              <w:rPr>
-                <w:rFonts w:ascii="Aptos" w:hAnsi="Aptos"/>
-                <w:b/>
-                <w:color w:val="9A5B00"/>
-                <w:sz w:val="16"/>
-              </w:rPr>
-              <w:t>REVIEW WORDING</w:t>
-            </w:r>
-          </w:p>
-        </w:tc>
-        <w:tc>
-          <w:tcPr>
-            <w:tcW w:type="dxa" w:w="5112"/>
-            <w:shd w:fill="FFFFFF"/>
-            <w:vAlign w:val="top"/>
-            <w:tcBorders>
-              <w:top w:val="single" w:sz="6" w:color="C8D5E3"/>
-              <w:start w:val="single" w:sz="6" w:color="C8D5E3"/>
-              <w:bottom w:val="single" w:sz="6" w:color="C8D5E3"/>
-              <w:end w:val="single" w:sz="6" w:color="C8D5E3"/>
-            </w:tcBorders>
-          </w:tcPr>
-          <w:p>
-            <w:pPr>
-              <w:spacing w:after="0"/>
-            </w:pPr>
-            <w:r>
-              <w:rPr>
-                <w:rFonts w:ascii="Aptos" w:hAnsi="Aptos"/>
-                <w:color w:val="14233B"/>
-                <w:sz w:val="23"/>
-              </w:rPr>
-              <w:t>The action labels tell me what kind of work I'm doing now. And the order shows me exactly when Week 4 is actually done.</w:t>
-            </w:r>
-          </w:p>
-        </w:tc>
-      </w:tr>
-    </w:tbl>
-    <w:p>
-      <w:pPr>
-        <w:spacing w:after="40"/>
-      </w:pPr>
     </w:p>
     <w:p>
       <w:pPr>
-        <w:spacing w:before="160" w:after="100"/>
+        <w:pStyle w:val="ListBullet"/>
       </w:pPr>
       <w:r>
-        <w:rPr>
-          <w:rFonts w:ascii="Aptos Display" w:hAnsi="Aptos Display"/>
-          <w:b/>
-          <w:color w:val="0B2348"/>
-          <w:sz w:val="30"/>
-        </w:rPr>
-        <w:t>Case 3: Assignment</w:t>
+        <w:t>Record dialogue only. Do not read labels, cues, IDs, or production notes.</w:t>
       </w:r>
-      <w:r>
-        <w:rPr>
-          <w:rFonts w:ascii="Aptos" w:hAnsi="Aptos"/>
-          <w:i/>
-          <w:color w:val="61748A"/>
-          <w:sz w:val="18"/>
-        </w:rPr>
-        <w:t xml:space="preserve">  Review wording before recording.</w:t>
-      </w:r>
-    </w:p>
-    <w:tbl>
-      <w:tblPr>
-        <w:tblW w:type="auto" w:w="0"/>
-        <w:jc w:val="center"/>
-        <w:tblLayout w:type="fixed"/>
-        <w:tblLook w:firstColumn="1" w:firstRow="1" w:lastColumn="0" w:lastRow="0" w:noHBand="0" w:noVBand="1" w:val="04A0"/>
-      </w:tblPr>
-      <w:tblGrid>
-        <w:gridCol w:w="3096"/>
-        <w:gridCol w:w="6984"/>
-      </w:tblGrid>
-      <w:tr>
-        <w:trPr>
-          <w:cantSplit/>
-        </w:trPr>
-        <w:tc>
-          <w:tcPr>
-            <w:tcW w:type="dxa" w:w="5112"/>
-            <w:shd w:fill="FBF7ED"/>
-            <w:vAlign w:val="top"/>
-            <w:tcBorders>
-              <w:top w:val="single" w:sz="6" w:color="C8D5E3"/>
-              <w:start w:val="single" w:sz="6" w:color="C8D5E3"/>
-              <w:bottom w:val="single" w:sz="6" w:color="C8D5E3"/>
-              <w:end w:val="single" w:sz="6" w:color="C8D5E3"/>
-            </w:tcBorders>
-          </w:tcPr>
-          <w:p>
-            <w:pPr>
-              <w:spacing w:after="40"/>
-            </w:pPr>
-            <w:r>
-              <w:rPr>
-                <w:rFonts w:ascii="Aptos" w:hAnsi="Aptos"/>
-                <w:b/>
-                <w:color w:val="0B2348"/>
-                <w:sz w:val="20"/>
-              </w:rPr>
-              <w:t>10 · e-s1-case-03b</w:t>
-            </w:r>
-          </w:p>
-          <w:p>
-            <w:pPr>
-              <w:spacing w:after="20"/>
-            </w:pPr>
-            <w:r>
-              <w:rPr>
-                <w:rFonts w:ascii="Aptos" w:hAnsi="Aptos"/>
-                <w:b/>
-                <w:color w:val="1178B5"/>
-                <w:sz w:val="18"/>
-              </w:rPr>
-              <w:t>e-s1-case-03b.mp3</w:t>
-            </w:r>
-          </w:p>
-          <w:p>
-            <w:pPr>
-              <w:spacing w:after="20"/>
-            </w:pPr>
-            <w:r>
-              <w:rPr>
-                <w:rFonts w:ascii="Aptos" w:hAnsi="Aptos"/>
-                <w:color w:val="61748A"/>
-                <w:sz w:val="17"/>
-              </w:rPr>
-              <w:t>Uncertain · s1_case_assignment_briefing</w:t>
-            </w:r>
-          </w:p>
-          <w:p>
-            <w:pPr>
-              <w:spacing w:after="0"/>
-            </w:pPr>
-            <w:r>
-              <w:rPr>
-                <w:rFonts w:ascii="Aptos" w:hAnsi="Aptos"/>
-                <w:b/>
-                <w:color w:val="9A5B00"/>
-                <w:sz w:val="16"/>
-              </w:rPr>
-              <w:t>REVIEW WORDING</w:t>
-            </w:r>
-          </w:p>
-        </w:tc>
-        <w:tc>
-          <w:tcPr>
-            <w:tcW w:type="dxa" w:w="5112"/>
-            <w:shd w:fill="FFFFFF"/>
-            <w:vAlign w:val="top"/>
-            <w:tcBorders>
-              <w:top w:val="single" w:sz="6" w:color="C8D5E3"/>
-              <w:start w:val="single" w:sz="6" w:color="C8D5E3"/>
-              <w:bottom w:val="single" w:sz="6" w:color="C8D5E3"/>
-              <w:end w:val="single" w:sz="6" w:color="C8D5E3"/>
-            </w:tcBorders>
-          </w:tcPr>
-          <w:p>
-            <w:pPr>
-              <w:spacing w:after="0"/>
-            </w:pPr>
-            <w:r>
-              <w:rPr>
-                <w:rFonts w:ascii="Aptos" w:hAnsi="Aptos"/>
-                <w:color w:val="14233B"/>
-                <w:sz w:val="23"/>
-              </w:rPr>
-              <w:t>I know the readings and examples are supposed to be in play. But the actual requirements — what counts as evidence, what success looks like — that's buried somewhere else in the module.</w:t>
-            </w:r>
-          </w:p>
-        </w:tc>
-      </w:tr>
-    </w:tbl>
-    <w:p>
-      <w:pPr>
-        <w:spacing w:after="40"/>
-      </w:pPr>
-    </w:p>
-    <w:tbl>
-      <w:tblPr>
-        <w:tblW w:type="auto" w:w="0"/>
-        <w:jc w:val="center"/>
-        <w:tblLayout w:type="fixed"/>
-        <w:tblLook w:firstColumn="1" w:firstRow="1" w:lastColumn="0" w:lastRow="0" w:noHBand="0" w:noVBand="1" w:val="04A0"/>
-      </w:tblPr>
-      <w:tblGrid>
-        <w:gridCol w:w="3096"/>
-        <w:gridCol w:w="6984"/>
-      </w:tblGrid>
-      <w:tr>
-        <w:trPr>
-          <w:cantSplit/>
-        </w:trPr>
-        <w:tc>
-          <w:tcPr>
-            <w:tcW w:type="dxa" w:w="5112"/>
-            <w:shd w:fill="FBF7ED"/>
-            <w:vAlign w:val="top"/>
-            <w:tcBorders>
-              <w:top w:val="single" w:sz="6" w:color="C8D5E3"/>
-              <w:start w:val="single" w:sz="6" w:color="C8D5E3"/>
-              <w:bottom w:val="single" w:sz="6" w:color="C8D5E3"/>
-              <w:end w:val="single" w:sz="6" w:color="C8D5E3"/>
-            </w:tcBorders>
-          </w:tcPr>
-          <w:p>
-            <w:pPr>
-              <w:spacing w:after="40"/>
-            </w:pPr>
-            <w:r>
-              <w:rPr>
-                <w:rFonts w:ascii="Aptos" w:hAnsi="Aptos"/>
-                <w:b/>
-                <w:color w:val="0B2348"/>
-                <w:sz w:val="20"/>
-              </w:rPr>
-              <w:t>11 · e-s1-case-03d</w:t>
-            </w:r>
-          </w:p>
-          <w:p>
-            <w:pPr>
-              <w:spacing w:after="20"/>
-            </w:pPr>
-            <w:r>
-              <w:rPr>
-                <w:rFonts w:ascii="Aptos" w:hAnsi="Aptos"/>
-                <w:b/>
-                <w:color w:val="1178B5"/>
-                <w:sz w:val="18"/>
-              </w:rPr>
-              <w:t>e-s1-case-03d.mp3</w:t>
-            </w:r>
-          </w:p>
-          <w:p>
-            <w:pPr>
-              <w:spacing w:after="20"/>
-            </w:pPr>
-            <w:r>
-              <w:rPr>
-                <w:rFonts w:ascii="Aptos" w:hAnsi="Aptos"/>
-                <w:color w:val="61748A"/>
-                <w:sz w:val="17"/>
-              </w:rPr>
-              <w:t>Thinking · s1_case_assignment_explanation</w:t>
-            </w:r>
-          </w:p>
-          <w:p>
-            <w:pPr>
-              <w:spacing w:after="0"/>
-            </w:pPr>
-            <w:r>
-              <w:rPr>
-                <w:rFonts w:ascii="Aptos" w:hAnsi="Aptos"/>
-                <w:b/>
-                <w:color w:val="9A5B00"/>
-                <w:sz w:val="16"/>
-              </w:rPr>
-              <w:t>REVIEW WORDING</w:t>
-            </w:r>
-          </w:p>
-        </w:tc>
-        <w:tc>
-          <w:tcPr>
-            <w:tcW w:type="dxa" w:w="5112"/>
-            <w:shd w:fill="FFFFFF"/>
-            <w:vAlign w:val="top"/>
-            <w:tcBorders>
-              <w:top w:val="single" w:sz="6" w:color="C8D5E3"/>
-              <w:start w:val="single" w:sz="6" w:color="C8D5E3"/>
-              <w:bottom w:val="single" w:sz="6" w:color="C8D5E3"/>
-              <w:end w:val="single" w:sz="6" w:color="C8D5E3"/>
-            </w:tcBorders>
-          </w:tcPr>
-          <w:p>
-            <w:pPr>
-              <w:spacing w:after="0"/>
-            </w:pPr>
-            <w:r>
-              <w:rPr>
-                <w:rFonts w:ascii="Aptos" w:hAnsi="Aptos"/>
-                <w:color w:val="14233B"/>
-                <w:sz w:val="23"/>
-              </w:rPr>
-              <w:t>If the requirements live somewhere else, I'm building this from memory while I'm trying to write it. That's backwards.</w:t>
-            </w:r>
-          </w:p>
-        </w:tc>
-      </w:tr>
-    </w:tbl>
-    <w:p>
-      <w:pPr>
-        <w:spacing w:after="40"/>
-      </w:pPr>
-    </w:p>
-    <w:tbl>
-      <w:tblPr>
-        <w:tblW w:type="auto" w:w="0"/>
-        <w:jc w:val="center"/>
-        <w:tblLayout w:type="fixed"/>
-        <w:tblLook w:firstColumn="1" w:firstRow="1" w:lastColumn="0" w:lastRow="0" w:noHBand="0" w:noVBand="1" w:val="04A0"/>
-      </w:tblPr>
-      <w:tblGrid>
-        <w:gridCol w:w="3096"/>
-        <w:gridCol w:w="6984"/>
-      </w:tblGrid>
-      <w:tr>
-        <w:trPr>
-          <w:cantSplit/>
-        </w:trPr>
-        <w:tc>
-          <w:tcPr>
-            <w:tcW w:type="dxa" w:w="5112"/>
-            <w:shd w:fill="FBF7ED"/>
-            <w:vAlign w:val="top"/>
-            <w:tcBorders>
-              <w:top w:val="single" w:sz="6" w:color="C8D5E3"/>
-              <w:start w:val="single" w:sz="6" w:color="C8D5E3"/>
-              <w:bottom w:val="single" w:sz="6" w:color="C8D5E3"/>
-              <w:end w:val="single" w:sz="6" w:color="C8D5E3"/>
-            </w:tcBorders>
-          </w:tcPr>
-          <w:p>
-            <w:pPr>
-              <w:spacing w:after="40"/>
-            </w:pPr>
-            <w:r>
-              <w:rPr>
-                <w:rFonts w:ascii="Aptos" w:hAnsi="Aptos"/>
-                <w:b/>
-                <w:color w:val="0B2348"/>
-                <w:sz w:val="20"/>
-              </w:rPr>
-              <w:t>12 · e-s1-case-03ai-b</w:t>
-            </w:r>
-          </w:p>
-          <w:p>
-            <w:pPr>
-              <w:spacing w:after="20"/>
-            </w:pPr>
-            <w:r>
-              <w:rPr>
-                <w:rFonts w:ascii="Aptos" w:hAnsi="Aptos"/>
-                <w:b/>
-                <w:color w:val="1178B5"/>
-                <w:sz w:val="18"/>
-              </w:rPr>
-              <w:t>e-s1-case-03ai-b.mp3</w:t>
-            </w:r>
-          </w:p>
-          <w:p>
-            <w:pPr>
-              <w:spacing w:after="20"/>
-            </w:pPr>
-            <w:r>
-              <w:rPr>
-                <w:rFonts w:ascii="Aptos" w:hAnsi="Aptos"/>
-                <w:color w:val="61748A"/>
-                <w:sz w:val="17"/>
-              </w:rPr>
-              <w:t>Thinking · s1_case_assignment_ai_demo</w:t>
-            </w:r>
-          </w:p>
-          <w:p>
-            <w:pPr>
-              <w:spacing w:after="0"/>
-            </w:pPr>
-            <w:r>
-              <w:rPr>
-                <w:rFonts w:ascii="Aptos" w:hAnsi="Aptos"/>
-                <w:b/>
-                <w:color w:val="9A5B00"/>
-                <w:sz w:val="16"/>
-              </w:rPr>
-              <w:t>REVIEW WORDING</w:t>
-            </w:r>
-          </w:p>
-        </w:tc>
-        <w:tc>
-          <w:tcPr>
-            <w:tcW w:type="dxa" w:w="5112"/>
-            <w:shd w:fill="FFFFFF"/>
-            <w:vAlign w:val="top"/>
-            <w:tcBorders>
-              <w:top w:val="single" w:sz="6" w:color="C8D5E3"/>
-              <w:start w:val="single" w:sz="6" w:color="C8D5E3"/>
-              <w:bottom w:val="single" w:sz="6" w:color="C8D5E3"/>
-              <w:end w:val="single" w:sz="6" w:color="C8D5E3"/>
-            </w:tcBorders>
-          </w:tcPr>
-          <w:p>
-            <w:pPr>
-              <w:spacing w:after="0"/>
-            </w:pPr>
-            <w:r>
-              <w:rPr>
-                <w:rFonts w:ascii="Aptos" w:hAnsi="Aptos"/>
-                <w:color w:val="14233B"/>
-                <w:sz w:val="23"/>
-              </w:rPr>
-              <w:t>That turns scattered directions into a checklist I can work off of, instead of reconstructing it from memory every time.</w:t>
-            </w:r>
-          </w:p>
-        </w:tc>
-      </w:tr>
-    </w:tbl>
-    <w:p>
-      <w:pPr>
-        <w:spacing w:after="40"/>
-      </w:pPr>
-    </w:p>
-    <w:tbl>
-      <w:tblPr>
-        <w:tblW w:type="auto" w:w="0"/>
-        <w:jc w:val="center"/>
-        <w:tblLayout w:type="fixed"/>
-        <w:tblLook w:firstColumn="1" w:firstRow="1" w:lastColumn="0" w:lastRow="0" w:noHBand="0" w:noVBand="1" w:val="04A0"/>
-      </w:tblPr>
-      <w:tblGrid>
-        <w:gridCol w:w="3096"/>
-        <w:gridCol w:w="6984"/>
-      </w:tblGrid>
-      <w:tr>
-        <w:trPr>
-          <w:cantSplit/>
-        </w:trPr>
-        <w:tc>
-          <w:tcPr>
-            <w:tcW w:type="dxa" w:w="5112"/>
-            <w:shd w:fill="FBF7ED"/>
-            <w:vAlign w:val="top"/>
-            <w:tcBorders>
-              <w:top w:val="single" w:sz="6" w:color="C8D5E3"/>
-              <w:start w:val="single" w:sz="6" w:color="C8D5E3"/>
-              <w:bottom w:val="single" w:sz="6" w:color="C8D5E3"/>
-              <w:end w:val="single" w:sz="6" w:color="C8D5E3"/>
-            </w:tcBorders>
-          </w:tcPr>
-          <w:p>
-            <w:pPr>
-              <w:spacing w:after="40"/>
-            </w:pPr>
-            <w:r>
-              <w:rPr>
-                <w:rFonts w:ascii="Aptos" w:hAnsi="Aptos"/>
-                <w:b/>
-                <w:color w:val="0B2348"/>
-                <w:sz w:val="20"/>
-              </w:rPr>
-              <w:t>13 · e-s1-case-03f</w:t>
-            </w:r>
-          </w:p>
-          <w:p>
-            <w:pPr>
-              <w:spacing w:after="20"/>
-            </w:pPr>
-            <w:r>
-              <w:rPr>
-                <w:rFonts w:ascii="Aptos" w:hAnsi="Aptos"/>
-                <w:b/>
-                <w:color w:val="1178B5"/>
-                <w:sz w:val="18"/>
-              </w:rPr>
-              <w:t>e-s1-case-03f.mp3</w:t>
-            </w:r>
-          </w:p>
-          <w:p>
-            <w:pPr>
-              <w:spacing w:after="20"/>
-            </w:pPr>
-            <w:r>
-              <w:rPr>
-                <w:rFonts w:ascii="Aptos" w:hAnsi="Aptos"/>
-                <w:color w:val="61748A"/>
-                <w:sz w:val="17"/>
-              </w:rPr>
-              <w:t>Confident · s1_case_assignment_reveal</w:t>
-            </w:r>
-          </w:p>
-          <w:p>
-            <w:pPr>
-              <w:spacing w:after="0"/>
-            </w:pPr>
-            <w:r>
-              <w:rPr>
-                <w:rFonts w:ascii="Aptos" w:hAnsi="Aptos"/>
-                <w:b/>
-                <w:color w:val="9A5B00"/>
-                <w:sz w:val="16"/>
-              </w:rPr>
-              <w:t>REVIEW WORDING</w:t>
-            </w:r>
-          </w:p>
-        </w:tc>
-        <w:tc>
-          <w:tcPr>
-            <w:tcW w:type="dxa" w:w="5112"/>
-            <w:shd w:fill="FFFFFF"/>
-            <w:vAlign w:val="top"/>
-            <w:tcBorders>
-              <w:top w:val="single" w:sz="6" w:color="C8D5E3"/>
-              <w:start w:val="single" w:sz="6" w:color="C8D5E3"/>
-              <w:bottom w:val="single" w:sz="6" w:color="C8D5E3"/>
-              <w:end w:val="single" w:sz="6" w:color="C8D5E3"/>
-            </w:tcBorders>
-          </w:tcPr>
-          <w:p>
-            <w:pPr>
-              <w:spacing w:after="0"/>
-            </w:pPr>
-            <w:r>
-              <w:rPr>
-                <w:rFonts w:ascii="Aptos" w:hAnsi="Aptos"/>
-                <w:color w:val="14233B"/>
-                <w:sz w:val="23"/>
-              </w:rPr>
-              <w:t>Now the four required parts, the length, the due date, and what success looks like — it's all right there next to the submission.</w:t>
-            </w:r>
-          </w:p>
-        </w:tc>
-      </w:tr>
-    </w:tbl>
-    <w:p>
-      <w:pPr>
-        <w:spacing w:after="40"/>
-      </w:pPr>
     </w:p>
     <w:p>
       <w:pPr>
-        <w:spacing w:before="160" w:after="100"/>
+        <w:pStyle w:val="Heading1"/>
       </w:pPr>
       <w:r>
-        <w:rPr>
-          <w:rFonts w:ascii="Aptos Display" w:hAnsi="Aptos Display"/>
-          <w:b/>
-          <w:color w:val="0B2348"/>
-          <w:sz w:val="30"/>
-        </w:rPr>
-        <w:t>Case 4: Expectations</w:t>
-      </w:r>
-      <w:r>
-        <w:rPr>
-          <w:rFonts w:ascii="Aptos" w:hAnsi="Aptos"/>
-          <w:i/>
-          <w:color w:val="61748A"/>
-          <w:sz w:val="18"/>
-        </w:rPr>
-        <w:t xml:space="preserve">  Review wording before recording.</w:t>
+        <w:t>Performance direction</w:t>
       </w:r>
     </w:p>
-    <w:tbl>
-      <w:tblPr>
-        <w:tblW w:type="auto" w:w="0"/>
-        <w:jc w:val="center"/>
-        <w:tblLayout w:type="fixed"/>
-        <w:tblLook w:firstColumn="1" w:firstRow="1" w:lastColumn="0" w:lastRow="0" w:noHBand="0" w:noVBand="1" w:val="04A0"/>
-      </w:tblPr>
-      <w:tblGrid>
-        <w:gridCol w:w="3096"/>
-        <w:gridCol w:w="6984"/>
-      </w:tblGrid>
-      <w:tr>
-        <w:trPr>
-          <w:cantSplit/>
-        </w:trPr>
-        <w:tc>
-          <w:tcPr>
-            <w:tcW w:type="dxa" w:w="5112"/>
-            <w:shd w:fill="FBF7ED"/>
-            <w:vAlign w:val="top"/>
-            <w:tcBorders>
-              <w:top w:val="single" w:sz="6" w:color="C8D5E3"/>
-              <w:start w:val="single" w:sz="6" w:color="C8D5E3"/>
-              <w:bottom w:val="single" w:sz="6" w:color="C8D5E3"/>
-              <w:end w:val="single" w:sz="6" w:color="C8D5E3"/>
-            </w:tcBorders>
-          </w:tcPr>
-          <w:p>
-            <w:pPr>
-              <w:spacing w:after="40"/>
-            </w:pPr>
-            <w:r>
-              <w:rPr>
-                <w:rFonts w:ascii="Aptos" w:hAnsi="Aptos"/>
-                <w:b/>
-                <w:color w:val="0B2348"/>
-                <w:sz w:val="20"/>
-              </w:rPr>
-              <w:t>14 · e-s1-case-04b</w:t>
-            </w:r>
-          </w:p>
-          <w:p>
-            <w:pPr>
-              <w:spacing w:after="20"/>
-            </w:pPr>
-            <w:r>
-              <w:rPr>
-                <w:rFonts w:ascii="Aptos" w:hAnsi="Aptos"/>
-                <w:b/>
-                <w:color w:val="1178B5"/>
-                <w:sz w:val="18"/>
-              </w:rPr>
-              <w:t>e-s1-case-04b.mp3</w:t>
-            </w:r>
-          </w:p>
-          <w:p>
-            <w:pPr>
-              <w:spacing w:after="20"/>
-            </w:pPr>
-            <w:r>
-              <w:rPr>
-                <w:rFonts w:ascii="Aptos" w:hAnsi="Aptos"/>
-                <w:color w:val="61748A"/>
-                <w:sz w:val="17"/>
-              </w:rPr>
-              <w:t>Frustrated · s1_case_expectations_briefing</w:t>
-            </w:r>
-          </w:p>
-          <w:p>
-            <w:pPr>
-              <w:spacing w:after="0"/>
-            </w:pPr>
-            <w:r>
-              <w:rPr>
-                <w:rFonts w:ascii="Aptos" w:hAnsi="Aptos"/>
-                <w:b/>
-                <w:color w:val="9A5B00"/>
-                <w:sz w:val="16"/>
-              </w:rPr>
-              <w:t>REVIEW WORDING</w:t>
-            </w:r>
-          </w:p>
-        </w:tc>
-        <w:tc>
-          <w:tcPr>
-            <w:tcW w:type="dxa" w:w="5112"/>
-            <w:shd w:fill="FFFFFF"/>
-            <w:vAlign w:val="top"/>
-            <w:tcBorders>
-              <w:top w:val="single" w:sz="6" w:color="C8D5E3"/>
-              <w:start w:val="single" w:sz="6" w:color="C8D5E3"/>
-              <w:bottom w:val="single" w:sz="6" w:color="C8D5E3"/>
-              <w:end w:val="single" w:sz="6" w:color="C8D5E3"/>
-            </w:tcBorders>
-          </w:tcPr>
-          <w:p>
-            <w:pPr>
-              <w:spacing w:after="0"/>
-            </w:pPr>
-            <w:r>
-              <w:rPr>
-                <w:rFonts w:ascii="Aptos" w:hAnsi="Aptos"/>
-                <w:color w:val="14233B"/>
-                <w:sz w:val="23"/>
-              </w:rPr>
-              <w:t>The details are buried in a paragraph near the bottom. By the time I find out what the work actually requires, I've usually already started it wrong.</w:t>
-            </w:r>
-          </w:p>
-        </w:tc>
-      </w:tr>
-    </w:tbl>
     <w:p>
-      <w:pPr>
-        <w:spacing w:after="40"/>
-      </w:pPr>
-    </w:p>
-    <w:tbl>
-      <w:tblPr>
-        <w:tblW w:type="auto" w:w="0"/>
-        <w:jc w:val="center"/>
-        <w:tblLayout w:type="fixed"/>
-        <w:tblLook w:firstColumn="1" w:firstRow="1" w:lastColumn="0" w:lastRow="0" w:noHBand="0" w:noVBand="1" w:val="04A0"/>
-      </w:tblPr>
-      <w:tblGrid>
-        <w:gridCol w:w="3096"/>
-        <w:gridCol w:w="6984"/>
-      </w:tblGrid>
-      <w:tr>
-        <w:trPr>
-          <w:cantSplit/>
-        </w:trPr>
-        <w:tc>
-          <w:tcPr>
-            <w:tcW w:type="dxa" w:w="5112"/>
-            <w:shd w:fill="FBF7ED"/>
-            <w:vAlign w:val="top"/>
-            <w:tcBorders>
-              <w:top w:val="single" w:sz="6" w:color="C8D5E3"/>
-              <w:start w:val="single" w:sz="6" w:color="C8D5E3"/>
-              <w:bottom w:val="single" w:sz="6" w:color="C8D5E3"/>
-              <w:end w:val="single" w:sz="6" w:color="C8D5E3"/>
-            </w:tcBorders>
-          </w:tcPr>
-          <w:p>
-            <w:pPr>
-              <w:spacing w:after="40"/>
-            </w:pPr>
-            <w:r>
-              <w:rPr>
-                <w:rFonts w:ascii="Aptos" w:hAnsi="Aptos"/>
-                <w:b/>
-                <w:color w:val="0B2348"/>
-                <w:sz w:val="20"/>
-              </w:rPr>
-              <w:t>15 · e-s1-case-04d</w:t>
-            </w:r>
-          </w:p>
-          <w:p>
-            <w:pPr>
-              <w:spacing w:after="20"/>
-            </w:pPr>
-            <w:r>
-              <w:rPr>
-                <w:rFonts w:ascii="Aptos" w:hAnsi="Aptos"/>
-                <w:b/>
-                <w:color w:val="1178B5"/>
-                <w:sz w:val="18"/>
-              </w:rPr>
-              <w:t>e-s1-case-04d.mp3</w:t>
-            </w:r>
-          </w:p>
-          <w:p>
-            <w:pPr>
-              <w:spacing w:after="20"/>
-            </w:pPr>
-            <w:r>
-              <w:rPr>
-                <w:rFonts w:ascii="Aptos" w:hAnsi="Aptos"/>
-                <w:color w:val="61748A"/>
-                <w:sz w:val="17"/>
-              </w:rPr>
-              <w:t>Thinking · s1_case_expectations_explanation</w:t>
-            </w:r>
-          </w:p>
-          <w:p>
-            <w:pPr>
-              <w:spacing w:after="0"/>
-            </w:pPr>
-            <w:r>
-              <w:rPr>
-                <w:rFonts w:ascii="Aptos" w:hAnsi="Aptos"/>
-                <w:b/>
-                <w:color w:val="9A5B00"/>
-                <w:sz w:val="16"/>
-              </w:rPr>
-              <w:t>REVIEW WORDING</w:t>
-            </w:r>
-          </w:p>
-        </w:tc>
-        <w:tc>
-          <w:tcPr>
-            <w:tcW w:type="dxa" w:w="5112"/>
-            <w:shd w:fill="FFFFFF"/>
-            <w:vAlign w:val="top"/>
-            <w:tcBorders>
-              <w:top w:val="single" w:sz="6" w:color="C8D5E3"/>
-              <w:start w:val="single" w:sz="6" w:color="C8D5E3"/>
-              <w:bottom w:val="single" w:sz="6" w:color="C8D5E3"/>
-              <w:end w:val="single" w:sz="6" w:color="C8D5E3"/>
-            </w:tcBorders>
-          </w:tcPr>
-          <w:p>
-            <w:pPr>
-              <w:spacing w:after="0"/>
-            </w:pPr>
-            <w:r>
-              <w:rPr>
-                <w:rFonts w:ascii="Aptos" w:hAnsi="Aptos"/>
-                <w:color w:val="14233B"/>
-                <w:sz w:val="23"/>
-              </w:rPr>
-              <w:t>The directions are there. I just find them too late to plan my time or line up the right evidence while I'm working.</w:t>
-            </w:r>
-          </w:p>
-        </w:tc>
-      </w:tr>
-    </w:tbl>
-    <w:p>
-      <w:pPr>
-        <w:spacing w:after="40"/>
-      </w:pPr>
-    </w:p>
-    <w:tbl>
-      <w:tblPr>
-        <w:tblW w:type="auto" w:w="0"/>
-        <w:jc w:val="center"/>
-        <w:tblLayout w:type="fixed"/>
-        <w:tblLook w:firstColumn="1" w:firstRow="1" w:lastColumn="0" w:lastRow="0" w:noHBand="0" w:noVBand="1" w:val="04A0"/>
-      </w:tblPr>
-      <w:tblGrid>
-        <w:gridCol w:w="3096"/>
-        <w:gridCol w:w="6984"/>
-      </w:tblGrid>
-      <w:tr>
-        <w:trPr>
-          <w:cantSplit/>
-        </w:trPr>
-        <w:tc>
-          <w:tcPr>
-            <w:tcW w:type="dxa" w:w="5112"/>
-            <w:shd w:fill="FBF7ED"/>
-            <w:vAlign w:val="top"/>
-            <w:tcBorders>
-              <w:top w:val="single" w:sz="6" w:color="C8D5E3"/>
-              <w:start w:val="single" w:sz="6" w:color="C8D5E3"/>
-              <w:bottom w:val="single" w:sz="6" w:color="C8D5E3"/>
-              <w:end w:val="single" w:sz="6" w:color="C8D5E3"/>
-            </w:tcBorders>
-          </w:tcPr>
-          <w:p>
-            <w:pPr>
-              <w:spacing w:after="40"/>
-            </w:pPr>
-            <w:r>
-              <w:rPr>
-                <w:rFonts w:ascii="Aptos" w:hAnsi="Aptos"/>
-                <w:b/>
-                <w:color w:val="0B2348"/>
-                <w:sz w:val="20"/>
-              </w:rPr>
-              <w:t>16 · e-s1-case-04ai-b</w:t>
-            </w:r>
-          </w:p>
-          <w:p>
-            <w:pPr>
-              <w:spacing w:after="20"/>
-            </w:pPr>
-            <w:r>
-              <w:rPr>
-                <w:rFonts w:ascii="Aptos" w:hAnsi="Aptos"/>
-                <w:b/>
-                <w:color w:val="1178B5"/>
-                <w:sz w:val="18"/>
-              </w:rPr>
-              <w:t>e-s1-case-04ai-b.mp3</w:t>
-            </w:r>
-          </w:p>
-          <w:p>
-            <w:pPr>
-              <w:spacing w:after="20"/>
-            </w:pPr>
-            <w:r>
-              <w:rPr>
-                <w:rFonts w:ascii="Aptos" w:hAnsi="Aptos"/>
-                <w:color w:val="61748A"/>
-                <w:sz w:val="17"/>
-              </w:rPr>
-              <w:t>Thinking · s1_case_expectations_ai_demo</w:t>
-            </w:r>
-          </w:p>
-          <w:p>
-            <w:pPr>
-              <w:spacing w:after="0"/>
-            </w:pPr>
-            <w:r>
-              <w:rPr>
-                <w:rFonts w:ascii="Aptos" w:hAnsi="Aptos"/>
-                <w:b/>
-                <w:color w:val="9A5B00"/>
-                <w:sz w:val="16"/>
-              </w:rPr>
-              <w:t>REVIEW WORDING</w:t>
-            </w:r>
-          </w:p>
-        </w:tc>
-        <w:tc>
-          <w:tcPr>
-            <w:tcW w:type="dxa" w:w="5112"/>
-            <w:shd w:fill="FFFFFF"/>
-            <w:vAlign w:val="top"/>
-            <w:tcBorders>
-              <w:top w:val="single" w:sz="6" w:color="C8D5E3"/>
-              <w:start w:val="single" w:sz="6" w:color="C8D5E3"/>
-              <w:bottom w:val="single" w:sz="6" w:color="C8D5E3"/>
-              <w:end w:val="single" w:sz="6" w:color="C8D5E3"/>
-            </w:tcBorders>
-          </w:tcPr>
-          <w:p>
-            <w:pPr>
-              <w:spacing w:after="0"/>
-            </w:pPr>
-            <w:r>
-              <w:rPr>
-                <w:rFonts w:ascii="Aptos" w:hAnsi="Aptos"/>
-                <w:color w:val="14233B"/>
-                <w:sz w:val="23"/>
-              </w:rPr>
-              <w:t>That's useful for a first draft. But the instructor still owns the workload estimate, the outcome, the dates, accessibility, and tone — all of it.</w:t>
-            </w:r>
-          </w:p>
-        </w:tc>
-      </w:tr>
-    </w:tbl>
-    <w:p>
-      <w:pPr>
-        <w:spacing w:after="40"/>
-      </w:pPr>
-    </w:p>
-    <w:tbl>
-      <w:tblPr>
-        <w:tblW w:type="auto" w:w="0"/>
-        <w:jc w:val="center"/>
-        <w:tblLayout w:type="fixed"/>
-        <w:tblLook w:firstColumn="1" w:firstRow="1" w:lastColumn="0" w:lastRow="0" w:noHBand="0" w:noVBand="1" w:val="04A0"/>
-      </w:tblPr>
-      <w:tblGrid>
-        <w:gridCol w:w="3096"/>
-        <w:gridCol w:w="6984"/>
-      </w:tblGrid>
-      <w:tr>
-        <w:trPr>
-          <w:cantSplit/>
-        </w:trPr>
-        <w:tc>
-          <w:tcPr>
-            <w:tcW w:type="dxa" w:w="5112"/>
-            <w:shd w:fill="FBF7ED"/>
-            <w:vAlign w:val="top"/>
-            <w:tcBorders>
-              <w:top w:val="single" w:sz="6" w:color="C8D5E3"/>
-              <w:start w:val="single" w:sz="6" w:color="C8D5E3"/>
-              <w:bottom w:val="single" w:sz="6" w:color="C8D5E3"/>
-              <w:end w:val="single" w:sz="6" w:color="C8D5E3"/>
-            </w:tcBorders>
-          </w:tcPr>
-          <w:p>
-            <w:pPr>
-              <w:spacing w:after="40"/>
-            </w:pPr>
-            <w:r>
-              <w:rPr>
-                <w:rFonts w:ascii="Aptos" w:hAnsi="Aptos"/>
-                <w:b/>
-                <w:color w:val="0B2348"/>
-                <w:sz w:val="20"/>
-              </w:rPr>
-              <w:t>17 · e-s1-case-04f</w:t>
-            </w:r>
-          </w:p>
-          <w:p>
-            <w:pPr>
-              <w:spacing w:after="20"/>
-            </w:pPr>
-            <w:r>
-              <w:rPr>
-                <w:rFonts w:ascii="Aptos" w:hAnsi="Aptos"/>
-                <w:b/>
-                <w:color w:val="1178B5"/>
-                <w:sz w:val="18"/>
-              </w:rPr>
-              <w:t>e-s1-case-04f.mp3</w:t>
-            </w:r>
-          </w:p>
-          <w:p>
-            <w:pPr>
-              <w:spacing w:after="20"/>
-            </w:pPr>
-            <w:r>
-              <w:rPr>
-                <w:rFonts w:ascii="Aptos" w:hAnsi="Aptos"/>
-                <w:color w:val="61748A"/>
-                <w:sz w:val="17"/>
-              </w:rPr>
-              <w:t>Confident · s1_case_expectations_reveal</w:t>
-            </w:r>
-          </w:p>
-          <w:p>
-            <w:pPr>
-              <w:spacing w:after="0"/>
-            </w:pPr>
-            <w:r>
-              <w:rPr>
-                <w:rFonts w:ascii="Aptos" w:hAnsi="Aptos"/>
-                <w:b/>
-                <w:color w:val="9A5B00"/>
-                <w:sz w:val="16"/>
-              </w:rPr>
-              <w:t>REVIEW WORDING</w:t>
-            </w:r>
-          </w:p>
-        </w:tc>
-        <w:tc>
-          <w:tcPr>
-            <w:tcW w:type="dxa" w:w="5112"/>
-            <w:shd w:fill="FFFFFF"/>
-            <w:vAlign w:val="top"/>
-            <w:tcBorders>
-              <w:top w:val="single" w:sz="6" w:color="C8D5E3"/>
-              <w:start w:val="single" w:sz="6" w:color="C8D5E3"/>
-              <w:bottom w:val="single" w:sz="6" w:color="C8D5E3"/>
-              <w:end w:val="single" w:sz="6" w:color="C8D5E3"/>
-            </w:tcBorders>
-          </w:tcPr>
-          <w:p>
-            <w:pPr>
-              <w:spacing w:after="0"/>
-            </w:pPr>
-            <w:r>
-              <w:rPr>
-                <w:rFonts w:ascii="Aptos" w:hAnsi="Aptos"/>
-                <w:color w:val="14233B"/>
-                <w:sz w:val="23"/>
-              </w:rPr>
-              <w:t>This Start Here page gives me the purpose, the workload, the deadline, the outcome, and the next action — before I commit any time to it.</w:t>
-            </w:r>
-          </w:p>
-        </w:tc>
-      </w:tr>
-    </w:tbl>
-    <w:p>
-      <w:pPr>
-        <w:spacing w:after="40"/>
-      </w:pPr>
+      <w:r>
+        <w:t>Use a natural teaching or student voice. Keep the pacing conversational, avoid announcer delivery, and leave brief clean silence at the start and end for editing.</w:t>
+      </w:r>
     </w:p>
     <w:p>
       <w:pPr>
-        <w:spacing w:before="160" w:after="100"/>
+        <w:pStyle w:val="Heading1"/>
       </w:pPr>
       <w:r>
-        <w:rPr>
-          <w:rFonts w:ascii="Aptos Display" w:hAnsi="Aptos Display"/>
-          <w:b/>
-          <w:color w:val="0B2348"/>
-          <w:sz w:val="30"/>
-        </w:rPr>
-        <w:t>Canvas Rescue complete</w:t>
-      </w:r>
-      <w:r>
-        <w:rPr>
-          <w:rFonts w:ascii="Aptos" w:hAnsi="Aptos"/>
-          <w:i/>
-          <w:color w:val="61748A"/>
-          <w:sz w:val="18"/>
-        </w:rPr>
-        <w:t xml:space="preserve">  Review wording before recording.</w:t>
+        <w:t>File delivery checklist</w:t>
       </w:r>
     </w:p>
-    <w:tbl>
-      <w:tblPr>
-        <w:tblW w:type="auto" w:w="0"/>
-        <w:jc w:val="center"/>
-        <w:tblLayout w:type="fixed"/>
-        <w:tblLook w:firstColumn="1" w:firstRow="1" w:lastColumn="0" w:lastRow="0" w:noHBand="0" w:noVBand="1" w:val="04A0"/>
-      </w:tblPr>
-      <w:tblGrid>
-        <w:gridCol w:w="3096"/>
-        <w:gridCol w:w="6984"/>
-      </w:tblGrid>
-      <w:tr>
-        <w:trPr>
-          <w:cantSplit/>
-        </w:trPr>
-        <w:tc>
-          <w:tcPr>
-            <w:tcW w:type="dxa" w:w="5112"/>
-            <w:shd w:fill="FBF7ED"/>
-            <w:vAlign w:val="top"/>
-            <w:tcBorders>
-              <w:top w:val="single" w:sz="6" w:color="C8D5E3"/>
-              <w:start w:val="single" w:sz="6" w:color="C8D5E3"/>
-              <w:bottom w:val="single" w:sz="6" w:color="C8D5E3"/>
-              <w:end w:val="single" w:sz="6" w:color="C8D5E3"/>
-            </w:tcBorders>
-          </w:tcPr>
-          <w:p>
-            <w:pPr>
-              <w:spacing w:after="40"/>
-            </w:pPr>
-            <w:r>
-              <w:rPr>
-                <w:rFonts w:ascii="Aptos" w:hAnsi="Aptos"/>
-                <w:b/>
-                <w:color w:val="0B2348"/>
-                <w:sz w:val="20"/>
-              </w:rPr>
-              <w:t>18 · e-s1-rescue-01</w:t>
-            </w:r>
-          </w:p>
-          <w:p>
-            <w:pPr>
-              <w:spacing w:after="20"/>
-            </w:pPr>
-            <w:r>
-              <w:rPr>
-                <w:rFonts w:ascii="Aptos" w:hAnsi="Aptos"/>
-                <w:b/>
-                <w:color w:val="1178B5"/>
-                <w:sz w:val="18"/>
-              </w:rPr>
-              <w:t>e-s1-rescue-01.mp3</w:t>
-            </w:r>
-          </w:p>
-          <w:p>
-            <w:pPr>
-              <w:spacing w:after="20"/>
-            </w:pPr>
-            <w:r>
-              <w:rPr>
-                <w:rFonts w:ascii="Aptos" w:hAnsi="Aptos"/>
-                <w:color w:val="61748A"/>
-                <w:sz w:val="17"/>
-              </w:rPr>
-              <w:t>Confident · s1_canvas_rescue_complete</w:t>
-            </w:r>
-          </w:p>
-          <w:p>
-            <w:pPr>
-              <w:spacing w:after="0"/>
-            </w:pPr>
-            <w:r>
-              <w:rPr>
-                <w:rFonts w:ascii="Aptos" w:hAnsi="Aptos"/>
-                <w:b/>
-                <w:color w:val="9A5B00"/>
-                <w:sz w:val="16"/>
-              </w:rPr>
-              <w:t>REVIEW WORDING</w:t>
-            </w:r>
-          </w:p>
-        </w:tc>
-        <w:tc>
-          <w:tcPr>
-            <w:tcW w:type="dxa" w:w="5112"/>
-            <w:shd w:fill="FFFFFF"/>
-            <w:vAlign w:val="top"/>
-            <w:tcBorders>
-              <w:top w:val="single" w:sz="6" w:color="C8D5E3"/>
-              <w:start w:val="single" w:sz="6" w:color="C8D5E3"/>
-              <w:bottom w:val="single" w:sz="6" w:color="C8D5E3"/>
-              <w:end w:val="single" w:sz="6" w:color="C8D5E3"/>
-            </w:tcBorders>
-          </w:tcPr>
-          <w:p>
-            <w:pPr>
-              <w:spacing w:after="0"/>
-            </w:pPr>
-            <w:r>
-              <w:rPr>
-                <w:rFonts w:ascii="Aptos" w:hAnsi="Aptos"/>
-                <w:color w:val="14233B"/>
-                <w:sz w:val="23"/>
-              </w:rPr>
-              <w:t>From the student side, the repaired path tells me where to start, what I'm working toward, what to submit, and what happens next.</w:t>
-            </w:r>
-          </w:p>
-        </w:tc>
-      </w:tr>
-    </w:tbl>
     <w:p>
-      <w:pPr>
-        <w:spacing w:after="40"/>
-      </w:pPr>
+      <w:r>
+        <w:t>☐ Filename matches the approved tracker row</w:t>
+      </w:r>
+    </w:p>
+    <w:p>
+      <w:r>
+        <w:t>☐ No clipped first or last word</w:t>
+      </w:r>
+    </w:p>
+    <w:p>
+      <w:r>
+        <w:t>☐ No background music or room noise</w:t>
+      </w:r>
+    </w:p>
+    <w:p>
+      <w:r>
+        <w:t>☐ Expression and pacing match the approved cue</w:t>
+      </w:r>
+    </w:p>
+    <w:p>
+      <w:r>
+        <w:t>☐ File opens and plays before it is added to the repository</w:t>
+      </w:r>
     </w:p>
     <w:sectPr>
-      <w:footerReference w:type="default" r:id="rId9"/>
       <w:pgSz w:w="12240" w:h="15840"/>
-      <w:pgMar w:top="864" w:right="1008" w:bottom="864" w:left="1008" w:header="720" w:footer="720" w:gutter="0"/>
+      <w:pgMar w:top="1037" w:right="1181" w:bottom="1037" w:left="1181" w:header="720" w:footer="720" w:gutter="0"/>
       <w:cols w:space="720"/>
       <w:docGrid w:linePitch="360"/>
     </w:sectPr>
   </w:body>
 </w:document>
-</file>
-
-<file path=word/footer1.xml><?xml version="1.0" encoding="utf-8"?>
-<w:ftr xmlns:m="http://schemas.openxmlformats.org/officeDocument/2006/math" xmlns:mc="http://schemas.openxmlformats.org/markup-compatibility/2006" xmlns:mo="http://schemas.microsoft.com/office/mac/office/2008/main" xmlns:mv="urn:schemas-microsoft-com:mac:vml" xmlns:o="urn:schemas-microsoft-com:office:office" xmlns:r="http://schemas.openxmlformats.org/officeDocument/2006/relationships" xmlns:v="urn:schemas-microsoft-com:vml" xmlns:w10="urn:schemas-microsoft-com:office:word" xmlns:w14="http://schemas.microsoft.com/office/word/2010/wordml" xmlns:w="http://schemas.openxmlformats.org/wordprocessingml/2006/main" xmlns:wne="http://schemas.microsoft.com/office/word/2006/wordml" xmlns:wp14="http://schemas.microsoft.com/office/word/2010/wordprocessingDrawing" xmlns:wp="http://schemas.openxmlformats.org/drawingml/2006/wordprocessingDrawing" xmlns:wpc="http://schemas.microsoft.com/office/word/2010/wordprocessingCanvas" xmlns:wpg="http://schemas.microsoft.com/office/word/2010/wordprocessingGroup" xmlns:wpi="http://schemas.microsoft.com/office/word/2010/wordprocessingInk" xmlns:wps="http://schemas.microsoft.com/office/word/2010/wordprocessingShape" mc:Ignorable="w14 wp14">
-  <w:p>
-    <w:pPr>
-      <w:pStyle w:val="Footer"/>
-      <w:jc w:val="center"/>
-    </w:pPr>
-    <w:r>
-      <w:rPr>
-        <w:rFonts w:ascii="Aptos" w:hAnsi="Aptos"/>
-        <w:color w:val="61748A"/>
-        <w:sz w:val="16"/>
-      </w:rPr>
-      <w:t>PromptCraft · The Prompt Lab</w:t>
-    </w:r>
-  </w:p>
-</w:ftr>
 </file>
 
 <file path=word/numbering.xml><?xml version="1.0" encoding="utf-8"?>
@@ -2792,12 +635,9 @@
     <w:name w:val="Normal"/>
     <w:qFormat/>
     <w:rsid w:val="00FC693F"/>
-    <w:pPr>
-      <w:spacing w:after="100"/>
-    </w:pPr>
     <w:rPr>
       <w:rFonts w:ascii="Aptos" w:hAnsi="Aptos"/>
-      <w:color w:val="14233B"/>
+      <w:color w:val="20303C"/>
       <w:sz w:val="21"/>
     </w:rPr>
   </w:style>
@@ -2860,11 +700,11 @@
       <w:outlineLvl w:val="0"/>
     </w:pPr>
     <w:rPr>
-      <w:rFonts w:asciiTheme="majorHAnsi" w:eastAsiaTheme="majorEastAsia" w:hAnsiTheme="majorHAnsi" w:cstheme="majorBidi" w:ascii="Aptos Display" w:hAnsi="Aptos Display"/>
+      <w:rFonts w:asciiTheme="majorHAnsi" w:eastAsiaTheme="majorEastAsia" w:hAnsiTheme="majorHAnsi" w:cstheme="majorBidi"/>
       <w:b/>
       <w:bCs/>
-      <w:color w:val="0B2348"/>
-      <w:sz w:val="34"/>
+      <w:color w:val="365F91" w:themeColor="accent1" w:themeShade="BF"/>
+      <w:sz w:val="28"/>
       <w:szCs w:val="28"/>
     </w:rPr>
   </w:style>
@@ -2884,10 +724,10 @@
       <w:outlineLvl w:val="1"/>
     </w:pPr>
     <w:rPr>
-      <w:rFonts w:asciiTheme="majorHAnsi" w:eastAsiaTheme="majorEastAsia" w:hAnsiTheme="majorHAnsi" w:cstheme="majorBidi" w:ascii="Aptos Display" w:hAnsi="Aptos Display"/>
+      <w:rFonts w:asciiTheme="majorHAnsi" w:eastAsiaTheme="majorEastAsia" w:hAnsiTheme="majorHAnsi" w:cstheme="majorBidi"/>
       <w:b/>
       <w:bCs/>
-      <w:color w:val="1178B5"/>
+      <w:color w:val="4F81BD" w:themeColor="accent1"/>
       <w:sz w:val="26"/>
       <w:szCs w:val="26"/>
     </w:rPr>
@@ -3149,9 +989,8 @@
       <w:contextualSpacing/>
     </w:pPr>
     <w:rPr>
-      <w:rFonts w:asciiTheme="majorHAnsi" w:eastAsiaTheme="majorEastAsia" w:hAnsiTheme="majorHAnsi" w:cstheme="majorBidi" w:ascii="Aptos Display" w:hAnsi="Aptos Display"/>
-      <w:b/>
-      <w:color w:val="0B2348"/>
+      <w:rFonts w:asciiTheme="majorHAnsi" w:eastAsiaTheme="majorEastAsia" w:hAnsiTheme="majorHAnsi" w:cstheme="majorBidi"/>
+      <w:color w:val="17365D" w:themeColor="text2" w:themeShade="BF"/>
       <w:spacing w:val="5"/>
       <w:kern w:val="28"/>
       <w:sz w:val="52"/>

</xml_diff>